<commit_message>
Weekly report: use the real board columns for Plans (project scope now available)
Re-read the KuantorFlow Improvements board via gh's keyring auth (which
has the project scope) and replaced the theme-grouped Plans section with
the actual Highest Prio / Nice To Have / In Progress / Todo columns.

Co-Authored-By: Claude Fable 5 <noreply@anthropic.com>
</commit_message>
<xml_diff>
--- a/reports/2026-07-24-weekly-report.docx
+++ b/reports/2026-07-24-weekly-report.docx
@@ -1435,7 +1435,7 @@
           <w:color w:val="22303C"/>
           <w:sz w:val="22"/>
         </w:rPr>
-        <w:t>The project board isn't machine-readable without the scope.</w:t>
+        <w:t>Board access needs the right token.</w:t>
       </w:r>
       <w:r>
         <w:rPr>
@@ -1463,7 +1463,45 @@
           <w:color w:val="22303C"/>
           <w:sz w:val="22"/>
         </w:rPr>
-        <w:t xml:space="preserve"> token scope, which the current credential lacks — so this week's plan below is grouped from the open issues by theme rather than by board column.</w:t>
+        <w:t xml:space="preserve"> scope; it lives on the </w:t>
+      </w:r>
+      <w:r>
+        <w:rPr>
+          <w:rFonts w:ascii="Consolas" w:hAnsi="Consolas"/>
+          <w:b w:val="0"/>
+          <w:i w:val="0"/>
+          <w:color w:val="22303C"/>
+          <w:sz w:val="22"/>
+        </w:rPr>
+        <w:t>gh</w:t>
+      </w:r>
+      <w:r>
+        <w:rPr>
+          <w:b w:val="0"/>
+          <w:i w:val="0"/>
+          <w:color w:val="22303C"/>
+          <w:sz w:val="22"/>
+        </w:rPr>
+        <w:t xml:space="preserve"> CLI's own keyring login, so the board is queried with </w:t>
+      </w:r>
+      <w:r>
+        <w:rPr>
+          <w:rFonts w:ascii="Consolas" w:hAnsi="Consolas"/>
+          <w:b w:val="0"/>
+          <w:i w:val="0"/>
+          <w:color w:val="22303C"/>
+          <w:sz w:val="22"/>
+        </w:rPr>
+        <w:t>gh</w:t>
+      </w:r>
+      <w:r>
+        <w:rPr>
+          <w:b w:val="0"/>
+          <w:i w:val="0"/>
+          <w:color w:val="22303C"/>
+          <w:sz w:val="22"/>
+        </w:rPr>
+        <w:t>'s auth rather than the repo PAT used for pushes. With that in place, the plan below reflects the real board columns.</w:t>
       </w:r>
     </w:p>
     <w:p>
@@ -1498,7 +1536,25 @@
           <w:color w:val="22303C"/>
           <w:sz w:val="22"/>
         </w:rPr>
-        <w:t>Grouped from the open issues across the three repositories. The precise "Highest Prio / Nice To Have" board columns could not be read this time (the credential lacks the GitHub `project` scope), so the grouping below is by theme.</w:t>
+        <w:t xml:space="preserve">Taken from the </w:t>
+      </w:r>
+      <w:r>
+        <w:rPr>
+          <w:b w:val="0"/>
+          <w:i/>
+          <w:color w:val="22303C"/>
+          <w:sz w:val="22"/>
+        </w:rPr>
+        <w:t>KuantorFlow Improvements</w:t>
+      </w:r>
+      <w:r>
+        <w:rPr>
+          <w:b w:val="0"/>
+          <w:i/>
+          <w:color w:val="22303C"/>
+          <w:sz w:val="22"/>
+        </w:rPr>
+        <w:t xml:space="preserve"> GitHub Projects board ([dashboard](https://github.com/users/Kuantor/projects/2)), in board-column order: Highest Prio and Nice To Have first, then In Progress and Todo.</w:t>
       </w:r>
     </w:p>
     <w:p>
@@ -1512,1373 +1568,7 @@
           <w:color w:val="22303C"/>
           <w:sz w:val="25"/>
         </w:rPr>
-        <w:t>Content &amp; note import</w:t>
-      </w:r>
-    </w:p>
-    <w:tbl>
-      <w:tblPr>
-        <w:tblStyle w:val="TableGrid"/>
-        <w:tblW w:type="auto" w:w="0"/>
-        <w:jc w:val="left"/>
-        <w:tblLayout w:type="fixed"/>
-        <w:tblLook w:firstColumn="1" w:firstRow="1" w:lastColumn="0" w:lastRow="0" w:noHBand="0" w:noVBand="1" w:val="04A0"/>
-      </w:tblPr>
-      <w:tblGrid>
-        <w:gridCol w:w="3283"/>
-        <w:gridCol w:w="3283"/>
-        <w:gridCol w:w="3283"/>
-      </w:tblGrid>
-      <w:tr>
-        <w:tc>
-          <w:tcPr>
-            <w:tcW w:type="dxa" w:w="1417"/>
-            <w:shd w:val="clear" w:fill="2E6BA0"/>
-          </w:tcPr>
-          <w:p>
-            <w:r>
-              <w:rPr>
-                <w:b/>
-                <w:i w:val="0"/>
-                <w:color w:val="FFFFFF"/>
-                <w:sz w:val="20"/>
-              </w:rPr>
-              <w:t>Repo</w:t>
-            </w:r>
-          </w:p>
-        </w:tc>
-        <w:tc>
-          <w:tcPr>
-            <w:tcW w:type="dxa" w:w="792"/>
-            <w:shd w:val="clear" w:fill="2E6BA0"/>
-          </w:tcPr>
-          <w:p>
-            <w:r>
-              <w:rPr>
-                <w:b/>
-                <w:i w:val="0"/>
-                <w:color w:val="FFFFFF"/>
-                <w:sz w:val="20"/>
-              </w:rPr>
-              <w:t>Issue</w:t>
-            </w:r>
-          </w:p>
-        </w:tc>
-        <w:tc>
-          <w:tcPr>
-            <w:tcW w:type="dxa" w:w="7731"/>
-            <w:shd w:val="clear" w:fill="2E6BA0"/>
-          </w:tcPr>
-          <w:p>
-            <w:r>
-              <w:rPr>
-                <w:b/>
-                <w:i w:val="0"/>
-                <w:color w:val="FFFFFF"/>
-                <w:sz w:val="20"/>
-              </w:rPr>
-              <w:t>Title</w:t>
-            </w:r>
-          </w:p>
-        </w:tc>
-      </w:tr>
-      <w:tr>
-        <w:tc>
-          <w:tcPr>
-            <w:tcW w:type="dxa" w:w="1417"/>
-          </w:tcPr>
-          <w:p>
-            <w:r>
-              <w:rPr>
-                <w:b w:val="0"/>
-                <w:i w:val="0"/>
-                <w:color w:val="22303C"/>
-                <w:sz w:val="20"/>
-              </w:rPr>
-              <w:t>kuantorflow</w:t>
-            </w:r>
-          </w:p>
-        </w:tc>
-        <w:tc>
-          <w:tcPr>
-            <w:tcW w:type="dxa" w:w="792"/>
-          </w:tcPr>
-          <w:p>
-            <w:r>
-              <w:rPr>
-                <w:b w:val="0"/>
-                <w:i w:val="0"/>
-                <w:color w:val="2E6BA0"/>
-                <w:sz w:val="20"/>
-              </w:rPr>
-              <w:t>#137</w:t>
-            </w:r>
-          </w:p>
-        </w:tc>
-        <w:tc>
-          <w:tcPr>
-            <w:tcW w:type="dxa" w:w="7731"/>
-          </w:tcPr>
-          <w:p>
-            <w:r>
-              <w:rPr>
-                <w:b w:val="0"/>
-                <w:i w:val="0"/>
-                <w:color w:val="22303C"/>
-                <w:sz w:val="20"/>
-              </w:rPr>
-              <w:t>Upload notes: support .txt and .docx besides .mht</w:t>
-            </w:r>
-          </w:p>
-        </w:tc>
-      </w:tr>
-      <w:tr>
-        <w:tc>
-          <w:tcPr>
-            <w:tcW w:type="dxa" w:w="1417"/>
-          </w:tcPr>
-          <w:p>
-            <w:r>
-              <w:rPr>
-                <w:b w:val="0"/>
-                <w:i w:val="0"/>
-                <w:color w:val="22303C"/>
-                <w:sz w:val="20"/>
-              </w:rPr>
-              <w:t>kuantorflow</w:t>
-            </w:r>
-          </w:p>
-        </w:tc>
-        <w:tc>
-          <w:tcPr>
-            <w:tcW w:type="dxa" w:w="792"/>
-          </w:tcPr>
-          <w:p>
-            <w:r>
-              <w:rPr>
-                <w:b w:val="0"/>
-                <w:i w:val="0"/>
-                <w:color w:val="2E6BA0"/>
-                <w:sz w:val="20"/>
-              </w:rPr>
-              <w:t>#144</w:t>
-            </w:r>
-          </w:p>
-        </w:tc>
-        <w:tc>
-          <w:tcPr>
-            <w:tcW w:type="dxa" w:w="7731"/>
-          </w:tcPr>
-          <w:p>
-            <w:r>
-              <w:rPr>
-                <w:b w:val="0"/>
-                <w:i w:val="0"/>
-                <w:color w:val="22303C"/>
-                <w:sz w:val="20"/>
-              </w:rPr>
-              <w:t>Add Ukrainian/Russian translations after parsing MHT files</w:t>
-            </w:r>
-          </w:p>
-        </w:tc>
-      </w:tr>
-      <w:tr>
-        <w:tc>
-          <w:tcPr>
-            <w:tcW w:type="dxa" w:w="1417"/>
-          </w:tcPr>
-          <w:p>
-            <w:r>
-              <w:rPr>
-                <w:b w:val="0"/>
-                <w:i w:val="0"/>
-                <w:color w:val="22303C"/>
-                <w:sz w:val="20"/>
-              </w:rPr>
-              <w:t>kuantorflow</w:t>
-            </w:r>
-          </w:p>
-        </w:tc>
-        <w:tc>
-          <w:tcPr>
-            <w:tcW w:type="dxa" w:w="792"/>
-          </w:tcPr>
-          <w:p>
-            <w:r>
-              <w:rPr>
-                <w:b w:val="0"/>
-                <w:i w:val="0"/>
-                <w:color w:val="2E6BA0"/>
-                <w:sz w:val="20"/>
-              </w:rPr>
-              <w:t>#136</w:t>
-            </w:r>
-          </w:p>
-        </w:tc>
-        <w:tc>
-          <w:tcPr>
-            <w:tcW w:type="dxa" w:w="7731"/>
-          </w:tcPr>
-          <w:p>
-            <w:r>
-              <w:rPr>
-                <w:b w:val="0"/>
-                <w:i w:val="0"/>
-                <w:color w:val="22303C"/>
-                <w:sz w:val="20"/>
-              </w:rPr>
-              <w:t>Images on flashcards (files on disk, path in MySQL)</w:t>
-            </w:r>
-          </w:p>
-        </w:tc>
-      </w:tr>
-      <w:tr>
-        <w:tc>
-          <w:tcPr>
-            <w:tcW w:type="dxa" w:w="1417"/>
-          </w:tcPr>
-          <w:p>
-            <w:r>
-              <w:rPr>
-                <w:b w:val="0"/>
-                <w:i w:val="0"/>
-                <w:color w:val="22303C"/>
-                <w:sz w:val="20"/>
-              </w:rPr>
-              <w:t>kuantorflow</w:t>
-            </w:r>
-          </w:p>
-        </w:tc>
-        <w:tc>
-          <w:tcPr>
-            <w:tcW w:type="dxa" w:w="792"/>
-          </w:tcPr>
-          <w:p>
-            <w:r>
-              <w:rPr>
-                <w:b w:val="0"/>
-                <w:i w:val="0"/>
-                <w:color w:val="2E6BA0"/>
-                <w:sz w:val="20"/>
-              </w:rPr>
-              <w:t>#147</w:t>
-            </w:r>
-          </w:p>
-        </w:tc>
-        <w:tc>
-          <w:tcPr>
-            <w:tcW w:type="dxa" w:w="7731"/>
-          </w:tcPr>
-          <w:p>
-            <w:r>
-              <w:rPr>
-                <w:b w:val="0"/>
-                <w:i w:val="0"/>
-                <w:color w:val="22303C"/>
-                <w:sz w:val="20"/>
-              </w:rPr>
-              <w:t>More accurate classification of words in the "General" topic</w:t>
-            </w:r>
-          </w:p>
-        </w:tc>
-      </w:tr>
-      <w:tr>
-        <w:tc>
-          <w:tcPr>
-            <w:tcW w:type="dxa" w:w="1417"/>
-          </w:tcPr>
-          <w:p>
-            <w:r>
-              <w:rPr>
-                <w:b w:val="0"/>
-                <w:i w:val="0"/>
-                <w:color w:val="22303C"/>
-                <w:sz w:val="20"/>
-              </w:rPr>
-              <w:t>kuantorflow</w:t>
-            </w:r>
-          </w:p>
-        </w:tc>
-        <w:tc>
-          <w:tcPr>
-            <w:tcW w:type="dxa" w:w="792"/>
-          </w:tcPr>
-          <w:p>
-            <w:r>
-              <w:rPr>
-                <w:b w:val="0"/>
-                <w:i w:val="0"/>
-                <w:color w:val="2E6BA0"/>
-                <w:sz w:val="20"/>
-              </w:rPr>
-              <w:t>#140</w:t>
-            </w:r>
-          </w:p>
-        </w:tc>
-        <w:tc>
-          <w:tcPr>
-            <w:tcW w:type="dxa" w:w="7731"/>
-          </w:tcPr>
-          <w:p>
-            <w:r>
-              <w:rPr>
-                <w:b w:val="0"/>
-                <w:i w:val="0"/>
-                <w:color w:val="22303C"/>
-                <w:sz w:val="20"/>
-              </w:rPr>
-              <w:t>[Optional] Upload notes: support .pdf (text-layer)</w:t>
-            </w:r>
-          </w:p>
-        </w:tc>
-      </w:tr>
-    </w:tbl>
-    <w:p>
-      <w:pPr>
-        <w:spacing w:after="40"/>
-      </w:pPr>
-    </w:p>
-    <w:p>
-      <w:pPr>
-        <w:pStyle w:val="Heading2"/>
-      </w:pPr>
-      <w:r>
-        <w:rPr>
-          <w:b w:val="0"/>
-          <w:i w:val="0"/>
-          <w:color w:val="22303C"/>
-          <w:sz w:val="25"/>
-        </w:rPr>
-        <w:t>New study modes &amp; word games</w:t>
-      </w:r>
-    </w:p>
-    <w:tbl>
-      <w:tblPr>
-        <w:tblStyle w:val="TableGrid"/>
-        <w:tblW w:type="auto" w:w="0"/>
-        <w:jc w:val="left"/>
-        <w:tblLayout w:type="fixed"/>
-        <w:tblLook w:firstColumn="1" w:firstRow="1" w:lastColumn="0" w:lastRow="0" w:noHBand="0" w:noVBand="1" w:val="04A0"/>
-      </w:tblPr>
-      <w:tblGrid>
-        <w:gridCol w:w="3283"/>
-        <w:gridCol w:w="3283"/>
-        <w:gridCol w:w="3283"/>
-      </w:tblGrid>
-      <w:tr>
-        <w:tc>
-          <w:tcPr>
-            <w:tcW w:type="dxa" w:w="1363"/>
-            <w:shd w:val="clear" w:fill="2E6BA0"/>
-          </w:tcPr>
-          <w:p>
-            <w:r>
-              <w:rPr>
-                <w:b/>
-                <w:i w:val="0"/>
-                <w:color w:val="FFFFFF"/>
-                <w:sz w:val="20"/>
-              </w:rPr>
-              <w:t>Repo</w:t>
-            </w:r>
-          </w:p>
-        </w:tc>
-        <w:tc>
-          <w:tcPr>
-            <w:tcW w:type="dxa" w:w="1363"/>
-            <w:shd w:val="clear" w:fill="2E6BA0"/>
-          </w:tcPr>
-          <w:p>
-            <w:r>
-              <w:rPr>
-                <w:b/>
-                <w:i w:val="0"/>
-                <w:color w:val="FFFFFF"/>
-                <w:sz w:val="20"/>
-              </w:rPr>
-              <w:t>Issue</w:t>
-            </w:r>
-          </w:p>
-        </w:tc>
-        <w:tc>
-          <w:tcPr>
-            <w:tcW w:type="dxa" w:w="7065"/>
-            <w:shd w:val="clear" w:fill="2E6BA0"/>
-          </w:tcPr>
-          <w:p>
-            <w:r>
-              <w:rPr>
-                <w:b/>
-                <w:i w:val="0"/>
-                <w:color w:val="FFFFFF"/>
-                <w:sz w:val="20"/>
-              </w:rPr>
-              <w:t>Title</w:t>
-            </w:r>
-          </w:p>
-        </w:tc>
-      </w:tr>
-      <w:tr>
-        <w:tc>
-          <w:tcPr>
-            <w:tcW w:type="dxa" w:w="1363"/>
-          </w:tcPr>
-          <w:p>
-            <w:r>
-              <w:rPr>
-                <w:b w:val="0"/>
-                <w:i w:val="0"/>
-                <w:color w:val="22303C"/>
-                <w:sz w:val="20"/>
-              </w:rPr>
-              <w:t>kuantorflow</w:t>
-            </w:r>
-          </w:p>
-        </w:tc>
-        <w:tc>
-          <w:tcPr>
-            <w:tcW w:type="dxa" w:w="1363"/>
-          </w:tcPr>
-          <w:p>
-            <w:r>
-              <w:rPr>
-                <w:b w:val="0"/>
-                <w:i w:val="0"/>
-                <w:color w:val="2E6BA0"/>
-                <w:sz w:val="20"/>
-              </w:rPr>
-              <w:t>#94</w:t>
-            </w:r>
-            <w:r>
-              <w:rPr>
-                <w:b w:val="0"/>
-                <w:i w:val="0"/>
-                <w:color w:val="22303C"/>
-                <w:sz w:val="20"/>
-              </w:rPr>
-              <w:t xml:space="preserve"> / </w:t>
-            </w:r>
-            <w:r>
-              <w:rPr>
-                <w:b w:val="0"/>
-                <w:i w:val="0"/>
-                <w:color w:val="2E6BA0"/>
-                <w:sz w:val="20"/>
-              </w:rPr>
-              <w:t>#92</w:t>
-            </w:r>
-          </w:p>
-        </w:tc>
-        <w:tc>
-          <w:tcPr>
-            <w:tcW w:type="dxa" w:w="7065"/>
-          </w:tcPr>
-          <w:p>
-            <w:r>
-              <w:rPr>
-                <w:b w:val="0"/>
-                <w:i w:val="0"/>
-                <w:color w:val="22303C"/>
-                <w:sz w:val="20"/>
-              </w:rPr>
-              <w:t>Spaced-repetition review mode (SM-2)</w:t>
-            </w:r>
-          </w:p>
-        </w:tc>
-      </w:tr>
-      <w:tr>
-        <w:tc>
-          <w:tcPr>
-            <w:tcW w:type="dxa" w:w="1363"/>
-          </w:tcPr>
-          <w:p>
-            <w:r>
-              <w:rPr>
-                <w:b w:val="0"/>
-                <w:i w:val="0"/>
-                <w:color w:val="22303C"/>
-                <w:sz w:val="20"/>
-              </w:rPr>
-              <w:t>kuantorflow</w:t>
-            </w:r>
-          </w:p>
-        </w:tc>
-        <w:tc>
-          <w:tcPr>
-            <w:tcW w:type="dxa" w:w="1363"/>
-          </w:tcPr>
-          <w:p>
-            <w:r>
-              <w:rPr>
-                <w:b w:val="0"/>
-                <w:i w:val="0"/>
-                <w:color w:val="2E6BA0"/>
-                <w:sz w:val="20"/>
-              </w:rPr>
-              <w:t>#127</w:t>
-            </w:r>
-          </w:p>
-        </w:tc>
-        <w:tc>
-          <w:tcPr>
-            <w:tcW w:type="dxa" w:w="7065"/>
-          </w:tcPr>
-          <w:p>
-            <w:r>
-              <w:rPr>
-                <w:b w:val="0"/>
-                <w:i w:val="0"/>
-                <w:color w:val="22303C"/>
-                <w:sz w:val="20"/>
-              </w:rPr>
-              <w:t>Create "Individual" cards mode</w:t>
-            </w:r>
-          </w:p>
-        </w:tc>
-      </w:tr>
-      <w:tr>
-        <w:tc>
-          <w:tcPr>
-            <w:tcW w:type="dxa" w:w="1363"/>
-          </w:tcPr>
-          <w:p>
-            <w:r>
-              <w:rPr>
-                <w:b w:val="0"/>
-                <w:i w:val="0"/>
-                <w:color w:val="22303C"/>
-                <w:sz w:val="20"/>
-              </w:rPr>
-              <w:t>kuantorflow</w:t>
-            </w:r>
-          </w:p>
-        </w:tc>
-        <w:tc>
-          <w:tcPr>
-            <w:tcW w:type="dxa" w:w="1363"/>
-          </w:tcPr>
-          <w:p>
-            <w:r>
-              <w:rPr>
-                <w:b w:val="0"/>
-                <w:i w:val="0"/>
-                <w:color w:val="2E6BA0"/>
-                <w:sz w:val="20"/>
-              </w:rPr>
-              <w:t>#129</w:t>
-            </w:r>
-          </w:p>
-        </w:tc>
-        <w:tc>
-          <w:tcPr>
-            <w:tcW w:type="dxa" w:w="7065"/>
-          </w:tcPr>
-          <w:p>
-            <w:r>
-              <w:rPr>
-                <w:b w:val="0"/>
-                <w:i w:val="0"/>
-                <w:color w:val="22303C"/>
-                <w:sz w:val="20"/>
-              </w:rPr>
-              <w:t>Smart word-manipulation techniques for exercises (spike)</w:t>
-            </w:r>
-          </w:p>
-        </w:tc>
-      </w:tr>
-      <w:tr>
-        <w:tc>
-          <w:tcPr>
-            <w:tcW w:type="dxa" w:w="1363"/>
-          </w:tcPr>
-          <w:p>
-            <w:r>
-              <w:rPr>
-                <w:b w:val="0"/>
-                <w:i w:val="0"/>
-                <w:color w:val="22303C"/>
-                <w:sz w:val="20"/>
-              </w:rPr>
-              <w:t>kuantorflow</w:t>
-            </w:r>
-          </w:p>
-        </w:tc>
-        <w:tc>
-          <w:tcPr>
-            <w:tcW w:type="dxa" w:w="1363"/>
-          </w:tcPr>
-          <w:p>
-            <w:r>
-              <w:rPr>
-                <w:b w:val="0"/>
-                <w:i w:val="0"/>
-                <w:color w:val="2E6BA0"/>
-                <w:sz w:val="20"/>
-              </w:rPr>
-              <w:t>#130</w:t>
-            </w:r>
-            <w:r>
-              <w:rPr>
-                <w:b w:val="0"/>
-                <w:i w:val="0"/>
-                <w:color w:val="22303C"/>
-                <w:sz w:val="20"/>
-              </w:rPr>
-              <w:t xml:space="preserve"> / </w:t>
-            </w:r>
-            <w:r>
-              <w:rPr>
-                <w:b w:val="0"/>
-                <w:i w:val="0"/>
-                <w:color w:val="2E6BA0"/>
-                <w:sz w:val="20"/>
-              </w:rPr>
-              <w:t>#131</w:t>
-            </w:r>
-          </w:p>
-        </w:tc>
-        <w:tc>
-          <w:tcPr>
-            <w:tcW w:type="dxa" w:w="7065"/>
-          </w:tcPr>
-          <w:p>
-            <w:r>
-              <w:rPr>
-                <w:b w:val="0"/>
-                <w:i w:val="0"/>
-                <w:color w:val="22303C"/>
-                <w:sz w:val="20"/>
-              </w:rPr>
-              <w:t>Levenshtein / keyboard-adjacency MCQ distractors</w:t>
-            </w:r>
-          </w:p>
-        </w:tc>
-      </w:tr>
-      <w:tr>
-        <w:tc>
-          <w:tcPr>
-            <w:tcW w:type="dxa" w:w="1363"/>
-          </w:tcPr>
-          <w:p>
-            <w:r>
-              <w:rPr>
-                <w:b w:val="0"/>
-                <w:i w:val="0"/>
-                <w:color w:val="22303C"/>
-                <w:sz w:val="20"/>
-              </w:rPr>
-              <w:t>kuantorflow</w:t>
-            </w:r>
-          </w:p>
-        </w:tc>
-        <w:tc>
-          <w:tcPr>
-            <w:tcW w:type="dxa" w:w="1363"/>
-          </w:tcPr>
-          <w:p>
-            <w:r>
-              <w:rPr>
-                <w:b w:val="0"/>
-                <w:i w:val="0"/>
-                <w:color w:val="2E6BA0"/>
-                <w:sz w:val="20"/>
-              </w:rPr>
-              <w:t>#132</w:t>
-            </w:r>
-            <w:r>
-              <w:rPr>
-                <w:b w:val="0"/>
-                <w:i w:val="0"/>
-                <w:color w:val="22303C"/>
-                <w:sz w:val="20"/>
-              </w:rPr>
-              <w:t xml:space="preserve"> / </w:t>
-            </w:r>
-            <w:r>
-              <w:rPr>
-                <w:b w:val="0"/>
-                <w:i w:val="0"/>
-                <w:color w:val="2E6BA0"/>
-                <w:sz w:val="20"/>
-              </w:rPr>
-              <w:t>#133</w:t>
-            </w:r>
-          </w:p>
-        </w:tc>
-        <w:tc>
-          <w:tcPr>
-            <w:tcW w:type="dxa" w:w="7065"/>
-          </w:tcPr>
-          <w:p>
-            <w:r>
-              <w:rPr>
-                <w:b w:val="0"/>
-                <w:i w:val="0"/>
-                <w:color w:val="22303C"/>
-                <w:sz w:val="20"/>
-              </w:rPr>
-              <w:t>"Is this a real word?" &amp; typoglycemia modes</w:t>
-            </w:r>
-          </w:p>
-        </w:tc>
-      </w:tr>
-      <w:tr>
-        <w:tc>
-          <w:tcPr>
-            <w:tcW w:type="dxa" w:w="1363"/>
-          </w:tcPr>
-          <w:p>
-            <w:r>
-              <w:rPr>
-                <w:b w:val="0"/>
-                <w:i w:val="0"/>
-                <w:color w:val="22303C"/>
-                <w:sz w:val="20"/>
-              </w:rPr>
-              <w:t>kuantorflow</w:t>
-            </w:r>
-          </w:p>
-        </w:tc>
-        <w:tc>
-          <w:tcPr>
-            <w:tcW w:type="dxa" w:w="1363"/>
-          </w:tcPr>
-          <w:p>
-            <w:r>
-              <w:rPr>
-                <w:b w:val="0"/>
-                <w:i w:val="0"/>
-                <w:color w:val="2E6BA0"/>
-                <w:sz w:val="20"/>
-              </w:rPr>
-              <w:t>#100</w:t>
-            </w:r>
-          </w:p>
-        </w:tc>
-        <w:tc>
-          <w:tcPr>
-            <w:tcW w:type="dxa" w:w="7065"/>
-          </w:tcPr>
-          <w:p>
-            <w:r>
-              <w:rPr>
-                <w:b w:val="0"/>
-                <w:i w:val="0"/>
-                <w:color w:val="22303C"/>
-                <w:sz w:val="20"/>
-              </w:rPr>
-              <w:t>Quiz: treat perfective/imperfective answers as equal (AI)</w:t>
-            </w:r>
-          </w:p>
-        </w:tc>
-      </w:tr>
-    </w:tbl>
-    <w:p>
-      <w:pPr>
-        <w:spacing w:after="40"/>
-      </w:pPr>
-    </w:p>
-    <w:p>
-      <w:pPr>
-        <w:pStyle w:val="Heading2"/>
-      </w:pPr>
-      <w:r>
-        <w:rPr>
-          <w:b w:val="0"/>
-          <w:i w:val="0"/>
-          <w:color w:val="22303C"/>
-          <w:sz w:val="25"/>
-        </w:rPr>
-        <w:t>Multi-user, admin &amp; security</w:t>
-      </w:r>
-    </w:p>
-    <w:tbl>
-      <w:tblPr>
-        <w:tblStyle w:val="TableGrid"/>
-        <w:tblW w:type="auto" w:w="0"/>
-        <w:jc w:val="left"/>
-        <w:tblLayout w:type="fixed"/>
-        <w:tblLook w:firstColumn="1" w:firstRow="1" w:lastColumn="0" w:lastRow="0" w:noHBand="0" w:noVBand="1" w:val="04A0"/>
-      </w:tblPr>
-      <w:tblGrid>
-        <w:gridCol w:w="3283"/>
-        <w:gridCol w:w="3283"/>
-        <w:gridCol w:w="3283"/>
-      </w:tblGrid>
-      <w:tr>
-        <w:tc>
-          <w:tcPr>
-            <w:tcW w:type="dxa" w:w="1496"/>
-            <w:shd w:val="clear" w:fill="2E6BA0"/>
-          </w:tcPr>
-          <w:p>
-            <w:r>
-              <w:rPr>
-                <w:b/>
-                <w:i w:val="0"/>
-                <w:color w:val="FFFFFF"/>
-                <w:sz w:val="20"/>
-              </w:rPr>
-              <w:t>Repo</w:t>
-            </w:r>
-          </w:p>
-        </w:tc>
-        <w:tc>
-          <w:tcPr>
-            <w:tcW w:type="dxa" w:w="1496"/>
-            <w:shd w:val="clear" w:fill="2E6BA0"/>
-          </w:tcPr>
-          <w:p>
-            <w:r>
-              <w:rPr>
-                <w:b/>
-                <w:i w:val="0"/>
-                <w:color w:val="FFFFFF"/>
-                <w:sz w:val="20"/>
-              </w:rPr>
-              <w:t>Issue</w:t>
-            </w:r>
-          </w:p>
-        </w:tc>
-        <w:tc>
-          <w:tcPr>
-            <w:tcW w:type="dxa" w:w="6800"/>
-            <w:shd w:val="clear" w:fill="2E6BA0"/>
-          </w:tcPr>
-          <w:p>
-            <w:r>
-              <w:rPr>
-                <w:b/>
-                <w:i w:val="0"/>
-                <w:color w:val="FFFFFF"/>
-                <w:sz w:val="20"/>
-              </w:rPr>
-              <w:t>Title</w:t>
-            </w:r>
-          </w:p>
-        </w:tc>
-      </w:tr>
-      <w:tr>
-        <w:tc>
-          <w:tcPr>
-            <w:tcW w:type="dxa" w:w="1496"/>
-          </w:tcPr>
-          <w:p>
-            <w:r>
-              <w:rPr>
-                <w:b w:val="0"/>
-                <w:i w:val="0"/>
-                <w:color w:val="22303C"/>
-                <w:sz w:val="20"/>
-              </w:rPr>
-              <w:t>kuantorflow</w:t>
-            </w:r>
-          </w:p>
-        </w:tc>
-        <w:tc>
-          <w:tcPr>
-            <w:tcW w:type="dxa" w:w="1496"/>
-          </w:tcPr>
-          <w:p>
-            <w:r>
-              <w:rPr>
-                <w:b w:val="0"/>
-                <w:i w:val="0"/>
-                <w:color w:val="2E6BA0"/>
-                <w:sz w:val="20"/>
-              </w:rPr>
-              <w:t>#125</w:t>
-            </w:r>
-          </w:p>
-        </w:tc>
-        <w:tc>
-          <w:tcPr>
-            <w:tcW w:type="dxa" w:w="6800"/>
-          </w:tcPr>
-          <w:p>
-            <w:r>
-              <w:rPr>
-                <w:b w:val="0"/>
-                <w:i w:val="0"/>
-                <w:color w:val="22303C"/>
-                <w:sz w:val="20"/>
-              </w:rPr>
-              <w:t>Deny unauthorized users to add/change/delete words</w:t>
-            </w:r>
-          </w:p>
-        </w:tc>
-      </w:tr>
-      <w:tr>
-        <w:tc>
-          <w:tcPr>
-            <w:tcW w:type="dxa" w:w="1496"/>
-          </w:tcPr>
-          <w:p>
-            <w:r>
-              <w:rPr>
-                <w:b w:val="0"/>
-                <w:i w:val="0"/>
-                <w:color w:val="22303C"/>
-                <w:sz w:val="20"/>
-              </w:rPr>
-              <w:t>kuantorflow</w:t>
-            </w:r>
-          </w:p>
-        </w:tc>
-        <w:tc>
-          <w:tcPr>
-            <w:tcW w:type="dxa" w:w="1496"/>
-          </w:tcPr>
-          <w:p>
-            <w:r>
-              <w:rPr>
-                <w:b w:val="0"/>
-                <w:i w:val="0"/>
-                <w:color w:val="2E6BA0"/>
-                <w:sz w:val="20"/>
-              </w:rPr>
-              <w:t>#148</w:t>
-            </w:r>
-          </w:p>
-        </w:tc>
-        <w:tc>
-          <w:tcPr>
-            <w:tcW w:type="dxa" w:w="6800"/>
-          </w:tcPr>
-          <w:p>
-            <w:r>
-              <w:rPr>
-                <w:b w:val="0"/>
-                <w:i w:val="0"/>
-                <w:color w:val="22303C"/>
-                <w:sz w:val="20"/>
-              </w:rPr>
-              <w:t>IDs for users</w:t>
-            </w:r>
-          </w:p>
-        </w:tc>
-      </w:tr>
-      <w:tr>
-        <w:tc>
-          <w:tcPr>
-            <w:tcW w:type="dxa" w:w="1496"/>
-          </w:tcPr>
-          <w:p>
-            <w:r>
-              <w:rPr>
-                <w:b w:val="0"/>
-                <w:i w:val="0"/>
-                <w:color w:val="22303C"/>
-                <w:sz w:val="20"/>
-              </w:rPr>
-              <w:t>kuantorflow</w:t>
-            </w:r>
-          </w:p>
-        </w:tc>
-        <w:tc>
-          <w:tcPr>
-            <w:tcW w:type="dxa" w:w="1496"/>
-          </w:tcPr>
-          <w:p>
-            <w:r>
-              <w:rPr>
-                <w:b w:val="0"/>
-                <w:i w:val="0"/>
-                <w:color w:val="2E6BA0"/>
-                <w:sz w:val="20"/>
-              </w:rPr>
-              <w:t>#93</w:t>
-            </w:r>
-          </w:p>
-        </w:tc>
-        <w:tc>
-          <w:tcPr>
-            <w:tcW w:type="dxa" w:w="6800"/>
-          </w:tcPr>
-          <w:p>
-            <w:r>
-              <w:rPr>
-                <w:b w:val="0"/>
-                <w:i w:val="0"/>
-                <w:color w:val="22303C"/>
-                <w:sz w:val="20"/>
-              </w:rPr>
-              <w:t>Complete multi-user card ownership</w:t>
-            </w:r>
-          </w:p>
-        </w:tc>
-      </w:tr>
-      <w:tr>
-        <w:tc>
-          <w:tcPr>
-            <w:tcW w:type="dxa" w:w="1496"/>
-          </w:tcPr>
-          <w:p>
-            <w:r>
-              <w:rPr>
-                <w:b w:val="0"/>
-                <w:i w:val="0"/>
-                <w:color w:val="22303C"/>
-                <w:sz w:val="20"/>
-              </w:rPr>
-              <w:t>kuantorflow</w:t>
-            </w:r>
-          </w:p>
-        </w:tc>
-        <w:tc>
-          <w:tcPr>
-            <w:tcW w:type="dxa" w:w="1496"/>
-          </w:tcPr>
-          <w:p>
-            <w:r>
-              <w:rPr>
-                <w:b w:val="0"/>
-                <w:i w:val="0"/>
-                <w:color w:val="2E6BA0"/>
-                <w:sz w:val="20"/>
-              </w:rPr>
-              <w:t>#126</w:t>
-            </w:r>
-            <w:r>
-              <w:rPr>
-                <w:b w:val="0"/>
-                <w:i w:val="0"/>
-                <w:color w:val="22303C"/>
-                <w:sz w:val="20"/>
-              </w:rPr>
-              <w:t xml:space="preserve"> / </w:t>
-            </w:r>
-            <w:r>
-              <w:rPr>
-                <w:b w:val="0"/>
-                <w:i w:val="0"/>
-                <w:color w:val="2E6BA0"/>
-                <w:sz w:val="20"/>
-              </w:rPr>
-              <w:t>#139</w:t>
-            </w:r>
-          </w:p>
-        </w:tc>
-        <w:tc>
-          <w:tcPr>
-            <w:tcW w:type="dxa" w:w="6800"/>
-          </w:tcPr>
-          <w:p>
-            <w:r>
-              <w:rPr>
-                <w:b w:val="0"/>
-                <w:i w:val="0"/>
-                <w:color w:val="22303C"/>
-                <w:sz w:val="20"/>
-              </w:rPr>
-              <w:t>Blacklist file / delete-request to admin</w:t>
-            </w:r>
-          </w:p>
-        </w:tc>
-      </w:tr>
-    </w:tbl>
-    <w:p>
-      <w:pPr>
-        <w:spacing w:after="40"/>
-      </w:pPr>
-    </w:p>
-    <w:p>
-      <w:pPr>
-        <w:pStyle w:val="Heading2"/>
-      </w:pPr>
-      <w:r>
-        <w:rPr>
-          <w:b w:val="0"/>
-          <w:i w:val="0"/>
-          <w:color w:val="22303C"/>
-          <w:sz w:val="25"/>
-        </w:rPr>
-        <w:t>Mykola (ai_agent)</w:t>
-      </w:r>
-    </w:p>
-    <w:tbl>
-      <w:tblPr>
-        <w:tblStyle w:val="TableGrid"/>
-        <w:tblW w:type="auto" w:w="0"/>
-        <w:jc w:val="left"/>
-        <w:tblLayout w:type="fixed"/>
-        <w:tblLook w:firstColumn="1" w:firstRow="1" w:lastColumn="0" w:lastRow="0" w:noHBand="0" w:noVBand="1" w:val="04A0"/>
-      </w:tblPr>
-      <w:tblGrid>
-        <w:gridCol w:w="3283"/>
-        <w:gridCol w:w="3283"/>
-        <w:gridCol w:w="3283"/>
-      </w:tblGrid>
-      <w:tr>
-        <w:tc>
-          <w:tcPr>
-            <w:tcW w:type="dxa" w:w="1306"/>
-            <w:shd w:val="clear" w:fill="2E6BA0"/>
-          </w:tcPr>
-          <w:p>
-            <w:r>
-              <w:rPr>
-                <w:b/>
-                <w:i w:val="0"/>
-                <w:color w:val="FFFFFF"/>
-                <w:sz w:val="20"/>
-              </w:rPr>
-              <w:t>Repo</w:t>
-            </w:r>
-          </w:p>
-        </w:tc>
-        <w:tc>
-          <w:tcPr>
-            <w:tcW w:type="dxa" w:w="816"/>
-            <w:shd w:val="clear" w:fill="2E6BA0"/>
-          </w:tcPr>
-          <w:p>
-            <w:r>
-              <w:rPr>
-                <w:b/>
-                <w:i w:val="0"/>
-                <w:color w:val="FFFFFF"/>
-                <w:sz w:val="20"/>
-              </w:rPr>
-              <w:t>Issue</w:t>
-            </w:r>
-          </w:p>
-        </w:tc>
-        <w:tc>
-          <w:tcPr>
-            <w:tcW w:type="dxa" w:w="7670"/>
-            <w:shd w:val="clear" w:fill="2E6BA0"/>
-          </w:tcPr>
-          <w:p>
-            <w:r>
-              <w:rPr>
-                <w:b/>
-                <w:i w:val="0"/>
-                <w:color w:val="FFFFFF"/>
-                <w:sz w:val="20"/>
-              </w:rPr>
-              <w:t>Title</w:t>
-            </w:r>
-          </w:p>
-        </w:tc>
-      </w:tr>
-      <w:tr>
-        <w:tc>
-          <w:tcPr>
-            <w:tcW w:type="dxa" w:w="1306"/>
-          </w:tcPr>
-          <w:p>
-            <w:r>
-              <w:rPr>
-                <w:b w:val="0"/>
-                <w:i w:val="0"/>
-                <w:color w:val="22303C"/>
-                <w:sz w:val="20"/>
-              </w:rPr>
-              <w:t>ai_agent</w:t>
-            </w:r>
-          </w:p>
-        </w:tc>
-        <w:tc>
-          <w:tcPr>
-            <w:tcW w:type="dxa" w:w="816"/>
-          </w:tcPr>
-          <w:p>
-            <w:r>
-              <w:rPr>
-                <w:b w:val="0"/>
-                <w:i w:val="0"/>
-                <w:color w:val="2E6BA0"/>
-                <w:sz w:val="20"/>
-              </w:rPr>
-              <w:t>#57</w:t>
-            </w:r>
-          </w:p>
-        </w:tc>
-        <w:tc>
-          <w:tcPr>
-            <w:tcW w:type="dxa" w:w="7670"/>
-          </w:tcPr>
-          <w:p>
-            <w:r>
-              <w:rPr>
-                <w:b w:val="0"/>
-                <w:i w:val="0"/>
-                <w:color w:val="22303C"/>
-                <w:sz w:val="20"/>
-              </w:rPr>
-              <w:t>Confirmation popup for Mykola adding cards</w:t>
-            </w:r>
-          </w:p>
-        </w:tc>
-      </w:tr>
-      <w:tr>
-        <w:tc>
-          <w:tcPr>
-            <w:tcW w:type="dxa" w:w="1306"/>
-          </w:tcPr>
-          <w:p>
-            <w:r>
-              <w:rPr>
-                <w:b w:val="0"/>
-                <w:i w:val="0"/>
-                <w:color w:val="22303C"/>
-                <w:sz w:val="20"/>
-              </w:rPr>
-              <w:t>ai_agent</w:t>
-            </w:r>
-          </w:p>
-        </w:tc>
-        <w:tc>
-          <w:tcPr>
-            <w:tcW w:type="dxa" w:w="816"/>
-          </w:tcPr>
-          <w:p>
-            <w:r>
-              <w:rPr>
-                <w:b w:val="0"/>
-                <w:i w:val="0"/>
-                <w:color w:val="2E6BA0"/>
-                <w:sz w:val="20"/>
-              </w:rPr>
-              <w:t>#19</w:t>
-            </w:r>
-          </w:p>
-        </w:tc>
-        <w:tc>
-          <w:tcPr>
-            <w:tcW w:type="dxa" w:w="7670"/>
-          </w:tcPr>
-          <w:p>
-            <w:r>
-              <w:rPr>
-                <w:b w:val="0"/>
-                <w:i w:val="0"/>
-                <w:color w:val="22303C"/>
-                <w:sz w:val="20"/>
-              </w:rPr>
-              <w:t>Teach Mykola to complement/extend card meanings</w:t>
-            </w:r>
-          </w:p>
-        </w:tc>
-      </w:tr>
-      <w:tr>
-        <w:tc>
-          <w:tcPr>
-            <w:tcW w:type="dxa" w:w="1306"/>
-          </w:tcPr>
-          <w:p>
-            <w:r>
-              <w:rPr>
-                <w:b w:val="0"/>
-                <w:i w:val="0"/>
-                <w:color w:val="22303C"/>
-                <w:sz w:val="20"/>
-              </w:rPr>
-              <w:t>ai_agent</w:t>
-            </w:r>
-          </w:p>
-        </w:tc>
-        <w:tc>
-          <w:tcPr>
-            <w:tcW w:type="dxa" w:w="816"/>
-          </w:tcPr>
-          <w:p>
-            <w:r>
-              <w:rPr>
-                <w:b w:val="0"/>
-                <w:i w:val="0"/>
-                <w:color w:val="2E6BA0"/>
-                <w:sz w:val="20"/>
-              </w:rPr>
-              <w:t>#56</w:t>
-            </w:r>
-          </w:p>
-        </w:tc>
-        <w:tc>
-          <w:tcPr>
-            <w:tcW w:type="dxa" w:w="7670"/>
-          </w:tcPr>
-          <w:p>
-            <w:r>
-              <w:rPr>
-                <w:b w:val="0"/>
-                <w:i w:val="0"/>
-                <w:color w:val="22303C"/>
-                <w:sz w:val="20"/>
-              </w:rPr>
-              <w:t>Make Mykola's avatar bigger</w:t>
-            </w:r>
-          </w:p>
-        </w:tc>
-      </w:tr>
-      <w:tr>
-        <w:tc>
-          <w:tcPr>
-            <w:tcW w:type="dxa" w:w="1306"/>
-          </w:tcPr>
-          <w:p>
-            <w:r>
-              <w:rPr>
-                <w:b w:val="0"/>
-                <w:i w:val="0"/>
-                <w:color w:val="22303C"/>
-                <w:sz w:val="20"/>
-              </w:rPr>
-              <w:t>ai_agent</w:t>
-            </w:r>
-          </w:p>
-        </w:tc>
-        <w:tc>
-          <w:tcPr>
-            <w:tcW w:type="dxa" w:w="816"/>
-          </w:tcPr>
-          <w:p>
-            <w:r>
-              <w:rPr>
-                <w:b w:val="0"/>
-                <w:i w:val="0"/>
-                <w:color w:val="2E6BA0"/>
-                <w:sz w:val="20"/>
-              </w:rPr>
-              <w:t>#58</w:t>
-            </w:r>
-          </w:p>
-        </w:tc>
-        <w:tc>
-          <w:tcPr>
-            <w:tcW w:type="dxa" w:w="7670"/>
-          </w:tcPr>
-          <w:p>
-            <w:r>
-              <w:rPr>
-                <w:b w:val="0"/>
-                <w:i w:val="0"/>
-                <w:color w:val="22303C"/>
-                <w:sz w:val="20"/>
-              </w:rPr>
-              <w:t>Save the conversation to a file</w:t>
-            </w:r>
-          </w:p>
-        </w:tc>
-      </w:tr>
-    </w:tbl>
-    <w:p>
-      <w:pPr>
-        <w:spacing w:after="40"/>
-      </w:pPr>
-    </w:p>
-    <w:p>
-      <w:pPr>
-        <w:pStyle w:val="Heading2"/>
-      </w:pPr>
-      <w:r>
-        <w:rPr>
-          <w:b w:val="0"/>
-          <w:i w:val="0"/>
-          <w:color w:val="22303C"/>
-          <w:sz w:val="25"/>
-        </w:rPr>
-        <w:t>UI polish &amp; investigations</w:t>
+        <w:t>Highest Prio</w:t>
       </w:r>
     </w:p>
     <w:tbl>
@@ -2914,7 +1604,7 @@
         </w:tc>
         <w:tc>
           <w:tcPr>
-            <w:tcW w:type="dxa" w:w="1088"/>
+            <w:tcW w:type="dxa" w:w="792"/>
             <w:shd w:val="clear" w:fill="2E6BA0"/>
           </w:tcPr>
           <w:p>
@@ -2931,7 +1621,7 @@
         </w:tc>
         <w:tc>
           <w:tcPr>
-            <w:tcW w:type="dxa" w:w="7374"/>
+            <w:tcW w:type="dxa" w:w="7858"/>
             <w:shd w:val="clear" w:fill="2E6BA0"/>
           </w:tcPr>
           <w:p>
@@ -2966,7 +1656,307 @@
         </w:tc>
         <w:tc>
           <w:tcPr>
-            <w:tcW w:type="dxa" w:w="1088"/>
+            <w:tcW w:type="dxa" w:w="792"/>
+          </w:tcPr>
+          <w:p>
+            <w:r>
+              <w:rPr>
+                <w:b w:val="0"/>
+                <w:i w:val="0"/>
+                <w:color w:val="2E6BA0"/>
+                <w:sz w:val="20"/>
+              </w:rPr>
+              <w:t>#30</w:t>
+            </w:r>
+          </w:p>
+        </w:tc>
+        <w:tc>
+          <w:tcPr>
+            <w:tcW w:type="dxa" w:w="7858"/>
+          </w:tcPr>
+          <w:p>
+            <w:r>
+              <w:rPr>
+                <w:b w:val="0"/>
+                <w:i w:val="0"/>
+                <w:color w:val="22303C"/>
+                <w:sz w:val="20"/>
+              </w:rPr>
+              <w:t>Create logs for various actions in the app</w:t>
+            </w:r>
+          </w:p>
+        </w:tc>
+      </w:tr>
+      <w:tr>
+        <w:tc>
+          <w:tcPr>
+            <w:tcW w:type="dxa" w:w="1330"/>
+          </w:tcPr>
+          <w:p>
+            <w:r>
+              <w:rPr>
+                <w:b w:val="0"/>
+                <w:i w:val="0"/>
+                <w:color w:val="22303C"/>
+                <w:sz w:val="20"/>
+              </w:rPr>
+              <w:t>kuantorflow</w:t>
+            </w:r>
+          </w:p>
+        </w:tc>
+        <w:tc>
+          <w:tcPr>
+            <w:tcW w:type="dxa" w:w="792"/>
+          </w:tcPr>
+          <w:p>
+            <w:r>
+              <w:rPr>
+                <w:b w:val="0"/>
+                <w:i w:val="0"/>
+                <w:color w:val="2E6BA0"/>
+                <w:sz w:val="20"/>
+              </w:rPr>
+              <w:t>#45</w:t>
+            </w:r>
+          </w:p>
+        </w:tc>
+        <w:tc>
+          <w:tcPr>
+            <w:tcW w:type="dxa" w:w="7858"/>
+          </w:tcPr>
+          <w:p>
+            <w:r>
+              <w:rPr>
+                <w:b w:val="0"/>
+                <w:i w:val="0"/>
+                <w:color w:val="22303C"/>
+                <w:sz w:val="20"/>
+              </w:rPr>
+              <w:t>UI: enhance behaviour of MHT-processing results window</w:t>
+            </w:r>
+          </w:p>
+        </w:tc>
+      </w:tr>
+      <w:tr>
+        <w:tc>
+          <w:tcPr>
+            <w:tcW w:type="dxa" w:w="1330"/>
+          </w:tcPr>
+          <w:p>
+            <w:r>
+              <w:rPr>
+                <w:b w:val="0"/>
+                <w:i w:val="0"/>
+                <w:color w:val="22303C"/>
+                <w:sz w:val="20"/>
+              </w:rPr>
+              <w:t>kuantorflow</w:t>
+            </w:r>
+          </w:p>
+        </w:tc>
+        <w:tc>
+          <w:tcPr>
+            <w:tcW w:type="dxa" w:w="792"/>
+          </w:tcPr>
+          <w:p>
+            <w:r>
+              <w:rPr>
+                <w:b w:val="0"/>
+                <w:i w:val="0"/>
+                <w:color w:val="2E6BA0"/>
+                <w:sz w:val="20"/>
+              </w:rPr>
+              <w:t>#100</w:t>
+            </w:r>
+          </w:p>
+        </w:tc>
+        <w:tc>
+          <w:tcPr>
+            <w:tcW w:type="dxa" w:w="7858"/>
+          </w:tcPr>
+          <w:p>
+            <w:r>
+              <w:rPr>
+                <w:b w:val="0"/>
+                <w:i w:val="0"/>
+                <w:color w:val="22303C"/>
+                <w:sz w:val="20"/>
+              </w:rPr>
+              <w:t>Quiz: treat perfective/imperfective answers as equal (AI)</w:t>
+            </w:r>
+          </w:p>
+        </w:tc>
+      </w:tr>
+      <w:tr>
+        <w:tc>
+          <w:tcPr>
+            <w:tcW w:type="dxa" w:w="1330"/>
+          </w:tcPr>
+          <w:p>
+            <w:r>
+              <w:rPr>
+                <w:b w:val="0"/>
+                <w:i w:val="0"/>
+                <w:color w:val="22303C"/>
+                <w:sz w:val="20"/>
+              </w:rPr>
+              <w:t>kuantorflow</w:t>
+            </w:r>
+          </w:p>
+        </w:tc>
+        <w:tc>
+          <w:tcPr>
+            <w:tcW w:type="dxa" w:w="792"/>
+          </w:tcPr>
+          <w:p>
+            <w:r>
+              <w:rPr>
+                <w:b w:val="0"/>
+                <w:i w:val="0"/>
+                <w:color w:val="2E6BA0"/>
+                <w:sz w:val="20"/>
+              </w:rPr>
+              <w:t>#137</w:t>
+            </w:r>
+          </w:p>
+        </w:tc>
+        <w:tc>
+          <w:tcPr>
+            <w:tcW w:type="dxa" w:w="7858"/>
+          </w:tcPr>
+          <w:p>
+            <w:r>
+              <w:rPr>
+                <w:b w:val="0"/>
+                <w:i w:val="0"/>
+                <w:color w:val="22303C"/>
+                <w:sz w:val="20"/>
+              </w:rPr>
+              <w:t>Upload notes: support .txt and .docx besides .mht</w:t>
+            </w:r>
+          </w:p>
+        </w:tc>
+      </w:tr>
+      <w:tr>
+        <w:tc>
+          <w:tcPr>
+            <w:tcW w:type="dxa" w:w="1330"/>
+          </w:tcPr>
+          <w:p>
+            <w:r>
+              <w:rPr>
+                <w:b w:val="0"/>
+                <w:i w:val="0"/>
+                <w:color w:val="22303C"/>
+                <w:sz w:val="20"/>
+              </w:rPr>
+              <w:t>kuantorflow</w:t>
+            </w:r>
+          </w:p>
+        </w:tc>
+        <w:tc>
+          <w:tcPr>
+            <w:tcW w:type="dxa" w:w="792"/>
+          </w:tcPr>
+          <w:p>
+            <w:r>
+              <w:rPr>
+                <w:b w:val="0"/>
+                <w:i w:val="0"/>
+                <w:color w:val="2E6BA0"/>
+                <w:sz w:val="20"/>
+              </w:rPr>
+              <w:t>#138</w:t>
+            </w:r>
+          </w:p>
+        </w:tc>
+        <w:tc>
+          <w:tcPr>
+            <w:tcW w:type="dxa" w:w="7858"/>
+          </w:tcPr>
+          <w:p>
+            <w:r>
+              <w:rPr>
+                <w:b w:val="0"/>
+                <w:i w:val="0"/>
+                <w:color w:val="22303C"/>
+                <w:sz w:val="20"/>
+              </w:rPr>
+              <w:t>Develop engaging flashcard topics for the online database</w:t>
+            </w:r>
+          </w:p>
+        </w:tc>
+      </w:tr>
+      <w:tr>
+        <w:tc>
+          <w:tcPr>
+            <w:tcW w:type="dxa" w:w="1330"/>
+          </w:tcPr>
+          <w:p>
+            <w:r>
+              <w:rPr>
+                <w:b w:val="0"/>
+                <w:i w:val="0"/>
+                <w:color w:val="22303C"/>
+                <w:sz w:val="20"/>
+              </w:rPr>
+              <w:t>kuantorflow</w:t>
+            </w:r>
+          </w:p>
+        </w:tc>
+        <w:tc>
+          <w:tcPr>
+            <w:tcW w:type="dxa" w:w="792"/>
+          </w:tcPr>
+          <w:p>
+            <w:r>
+              <w:rPr>
+                <w:b w:val="0"/>
+                <w:i w:val="0"/>
+                <w:color w:val="2E6BA0"/>
+                <w:sz w:val="20"/>
+              </w:rPr>
+              <w:t>#144</w:t>
+            </w:r>
+          </w:p>
+        </w:tc>
+        <w:tc>
+          <w:tcPr>
+            <w:tcW w:type="dxa" w:w="7858"/>
+          </w:tcPr>
+          <w:p>
+            <w:r>
+              <w:rPr>
+                <w:b w:val="0"/>
+                <w:i w:val="0"/>
+                <w:color w:val="22303C"/>
+                <w:sz w:val="20"/>
+              </w:rPr>
+              <w:t>Add Ukrainian/Russian translations after parsing MHT files</w:t>
+            </w:r>
+          </w:p>
+        </w:tc>
+      </w:tr>
+      <w:tr>
+        <w:tc>
+          <w:tcPr>
+            <w:tcW w:type="dxa" w:w="1330"/>
+          </w:tcPr>
+          <w:p>
+            <w:r>
+              <w:rPr>
+                <w:b w:val="0"/>
+                <w:i w:val="0"/>
+                <w:color w:val="22303C"/>
+                <w:sz w:val="20"/>
+              </w:rPr>
+              <w:t>kuantorflow</w:t>
+            </w:r>
+          </w:p>
+        </w:tc>
+        <w:tc>
+          <w:tcPr>
+            <w:tcW w:type="dxa" w:w="792"/>
           </w:tcPr>
           <w:p>
             <w:r>
@@ -2982,7 +1972,7 @@
         </w:tc>
         <w:tc>
           <w:tcPr>
-            <w:tcW w:type="dxa" w:w="7374"/>
+            <w:tcW w:type="dxa" w:w="7858"/>
           </w:tcPr>
           <w:p>
             <w:r>
@@ -3016,7 +2006,1641 @@
         </w:tc>
         <w:tc>
           <w:tcPr>
+            <w:tcW w:type="dxa" w:w="792"/>
+          </w:tcPr>
+          <w:p>
+            <w:r>
+              <w:rPr>
+                <w:b w:val="0"/>
+                <w:i w:val="0"/>
+                <w:color w:val="2E6BA0"/>
+                <w:sz w:val="20"/>
+              </w:rPr>
+              <w:t>#147</w:t>
+            </w:r>
+          </w:p>
+        </w:tc>
+        <w:tc>
+          <w:tcPr>
+            <w:tcW w:type="dxa" w:w="7858"/>
+          </w:tcPr>
+          <w:p>
+            <w:r>
+              <w:rPr>
+                <w:b w:val="0"/>
+                <w:i w:val="0"/>
+                <w:color w:val="22303C"/>
+                <w:sz w:val="20"/>
+              </w:rPr>
+              <w:t>More accurate classification of words in the "General" topic + AI</w:t>
+            </w:r>
+          </w:p>
+        </w:tc>
+      </w:tr>
+      <w:tr>
+        <w:tc>
+          <w:tcPr>
+            <w:tcW w:type="dxa" w:w="1330"/>
+          </w:tcPr>
+          <w:p>
+            <w:r>
+              <w:rPr>
+                <w:b w:val="0"/>
+                <w:i w:val="0"/>
+                <w:color w:val="22303C"/>
+                <w:sz w:val="20"/>
+              </w:rPr>
+              <w:t>ai_agent</w:t>
+            </w:r>
+          </w:p>
+        </w:tc>
+        <w:tc>
+          <w:tcPr>
+            <w:tcW w:type="dxa" w:w="792"/>
+          </w:tcPr>
+          <w:p>
+            <w:r>
+              <w:rPr>
+                <w:b w:val="0"/>
+                <w:i w:val="0"/>
+                <w:color w:val="2E6BA0"/>
+                <w:sz w:val="20"/>
+              </w:rPr>
+              <w:t>#19</w:t>
+            </w:r>
+          </w:p>
+        </w:tc>
+        <w:tc>
+          <w:tcPr>
+            <w:tcW w:type="dxa" w:w="7858"/>
+          </w:tcPr>
+          <w:p>
+            <w:r>
+              <w:rPr>
+                <w:b w:val="0"/>
+                <w:i w:val="0"/>
+                <w:color w:val="22303C"/>
+                <w:sz w:val="20"/>
+              </w:rPr>
+              <w:t>Teach Mykola to complement/extend card meanings</w:t>
+            </w:r>
+          </w:p>
+        </w:tc>
+      </w:tr>
+      <w:tr>
+        <w:tc>
+          <w:tcPr>
+            <w:tcW w:type="dxa" w:w="1330"/>
+          </w:tcPr>
+          <w:p>
+            <w:r>
+              <w:rPr>
+                <w:b w:val="0"/>
+                <w:i w:val="0"/>
+                <w:color w:val="22303C"/>
+                <w:sz w:val="20"/>
+              </w:rPr>
+              <w:t>ai_agent</w:t>
+            </w:r>
+          </w:p>
+        </w:tc>
+        <w:tc>
+          <w:tcPr>
+            <w:tcW w:type="dxa" w:w="792"/>
+          </w:tcPr>
+          <w:p>
+            <w:r>
+              <w:rPr>
+                <w:b w:val="0"/>
+                <w:i w:val="0"/>
+                <w:color w:val="2E6BA0"/>
+                <w:sz w:val="20"/>
+              </w:rPr>
+              <w:t>#54</w:t>
+            </w:r>
+          </w:p>
+        </w:tc>
+        <w:tc>
+          <w:tcPr>
+            <w:tcW w:type="dxa" w:w="7858"/>
+          </w:tcPr>
+          <w:p>
+            <w:r>
+              <w:rPr>
+                <w:b w:val="0"/>
+                <w:i w:val="0"/>
+                <w:color w:val="22303C"/>
+                <w:sz w:val="20"/>
+              </w:rPr>
+              <w:t>Restart Mykola's conversations frequently</w:t>
+            </w:r>
+          </w:p>
+        </w:tc>
+      </w:tr>
+    </w:tbl>
+    <w:p>
+      <w:pPr>
+        <w:spacing w:after="40"/>
+      </w:pPr>
+    </w:p>
+    <w:p>
+      <w:pPr>
+        <w:pStyle w:val="Heading2"/>
+      </w:pPr>
+      <w:r>
+        <w:rPr>
+          <w:b w:val="0"/>
+          <w:i w:val="0"/>
+          <w:color w:val="22303C"/>
+          <w:sz w:val="25"/>
+        </w:rPr>
+        <w:t>Nice To Have</w:t>
+      </w:r>
+    </w:p>
+    <w:tbl>
+      <w:tblPr>
+        <w:tblStyle w:val="TableGrid"/>
+        <w:tblW w:type="auto" w:w="0"/>
+        <w:jc w:val="left"/>
+        <w:tblLayout w:type="fixed"/>
+        <w:tblLook w:firstColumn="1" w:firstRow="1" w:lastColumn="0" w:lastRow="0" w:noHBand="0" w:noVBand="1" w:val="04A0"/>
+      </w:tblPr>
+      <w:tblGrid>
+        <w:gridCol w:w="3283"/>
+        <w:gridCol w:w="3283"/>
+        <w:gridCol w:w="3283"/>
+      </w:tblGrid>
+      <w:tr>
+        <w:tc>
+          <w:tcPr>
+            <w:tcW w:type="dxa" w:w="2013"/>
+            <w:shd w:val="clear" w:fill="2E6BA0"/>
+          </w:tcPr>
+          <w:p>
+            <w:r>
+              <w:rPr>
+                <w:b/>
+                <w:i w:val="0"/>
+                <w:color w:val="FFFFFF"/>
+                <w:sz w:val="20"/>
+              </w:rPr>
+              <w:t>Repo</w:t>
+            </w:r>
+          </w:p>
+        </w:tc>
+        <w:tc>
+          <w:tcPr>
+            <w:tcW w:type="dxa" w:w="1922"/>
+            <w:shd w:val="clear" w:fill="2E6BA0"/>
+          </w:tcPr>
+          <w:p>
+            <w:r>
+              <w:rPr>
+                <w:b/>
+                <w:i w:val="0"/>
+                <w:color w:val="FFFFFF"/>
+                <w:sz w:val="20"/>
+              </w:rPr>
+              <w:t>Issue</w:t>
+            </w:r>
+          </w:p>
+        </w:tc>
+        <w:tc>
+          <w:tcPr>
+            <w:tcW w:type="dxa" w:w="5857"/>
+            <w:shd w:val="clear" w:fill="2E6BA0"/>
+          </w:tcPr>
+          <w:p>
+            <w:r>
+              <w:rPr>
+                <w:b/>
+                <w:i w:val="0"/>
+                <w:color w:val="FFFFFF"/>
+                <w:sz w:val="20"/>
+              </w:rPr>
+              <w:t>Title</w:t>
+            </w:r>
+          </w:p>
+        </w:tc>
+      </w:tr>
+      <w:tr>
+        <w:tc>
+          <w:tcPr>
+            <w:tcW w:type="dxa" w:w="2013"/>
+          </w:tcPr>
+          <w:p>
+            <w:r>
+              <w:rPr>
+                <w:b w:val="0"/>
+                <w:i w:val="0"/>
+                <w:color w:val="22303C"/>
+                <w:sz w:val="20"/>
+              </w:rPr>
+              <w:t>kuantorflow</w:t>
+            </w:r>
+          </w:p>
+        </w:tc>
+        <w:tc>
+          <w:tcPr>
+            <w:tcW w:type="dxa" w:w="1922"/>
+          </w:tcPr>
+          <w:p>
+            <w:r>
+              <w:rPr>
+                <w:b w:val="0"/>
+                <w:i w:val="0"/>
+                <w:color w:val="2E6BA0"/>
+                <w:sz w:val="20"/>
+              </w:rPr>
+              <w:t>#22</w:t>
+            </w:r>
+          </w:p>
+        </w:tc>
+        <w:tc>
+          <w:tcPr>
+            <w:tcW w:type="dxa" w:w="5857"/>
+          </w:tcPr>
+          <w:p>
+            <w:r>
+              <w:rPr>
+                <w:b w:val="0"/>
+                <w:i w:val="0"/>
+                <w:color w:val="22303C"/>
+                <w:sz w:val="20"/>
+              </w:rPr>
+              <w:t>Redesign website for a modern look</w:t>
+            </w:r>
+          </w:p>
+        </w:tc>
+      </w:tr>
+      <w:tr>
+        <w:tc>
+          <w:tcPr>
+            <w:tcW w:type="dxa" w:w="2013"/>
+          </w:tcPr>
+          <w:p>
+            <w:r>
+              <w:rPr>
+                <w:b w:val="0"/>
+                <w:i w:val="0"/>
+                <w:color w:val="22303C"/>
+                <w:sz w:val="20"/>
+              </w:rPr>
+              <w:t>kuantorflow</w:t>
+            </w:r>
+          </w:p>
+        </w:tc>
+        <w:tc>
+          <w:tcPr>
+            <w:tcW w:type="dxa" w:w="1922"/>
+          </w:tcPr>
+          <w:p>
+            <w:r>
+              <w:rPr>
+                <w:b w:val="0"/>
+                <w:i w:val="0"/>
+                <w:color w:val="2E6BA0"/>
+                <w:sz w:val="20"/>
+              </w:rPr>
+              <w:t>#92</w:t>
+            </w:r>
+            <w:r>
+              <w:rPr>
+                <w:b w:val="0"/>
+                <w:i w:val="0"/>
+                <w:color w:val="22303C"/>
+                <w:sz w:val="20"/>
+              </w:rPr>
+              <w:t xml:space="preserve"> / </w:t>
+            </w:r>
+            <w:r>
+              <w:rPr>
+                <w:b w:val="0"/>
+                <w:i w:val="0"/>
+                <w:color w:val="2E6BA0"/>
+                <w:sz w:val="20"/>
+              </w:rPr>
+              <w:t>#94</w:t>
+            </w:r>
+          </w:p>
+        </w:tc>
+        <w:tc>
+          <w:tcPr>
+            <w:tcW w:type="dxa" w:w="5857"/>
+          </w:tcPr>
+          <w:p>
+            <w:r>
+              <w:rPr>
+                <w:b w:val="0"/>
+                <w:i w:val="0"/>
+                <w:color w:val="22303C"/>
+                <w:sz w:val="20"/>
+              </w:rPr>
+              <w:t>Spaced-repetition review mode (SM-2)</w:t>
+            </w:r>
+          </w:p>
+        </w:tc>
+      </w:tr>
+      <w:tr>
+        <w:tc>
+          <w:tcPr>
+            <w:tcW w:type="dxa" w:w="2013"/>
+          </w:tcPr>
+          <w:p>
+            <w:r>
+              <w:rPr>
+                <w:b w:val="0"/>
+                <w:i w:val="0"/>
+                <w:color w:val="22303C"/>
+                <w:sz w:val="20"/>
+              </w:rPr>
+              <w:t>kuantorflow</w:t>
+            </w:r>
+          </w:p>
+        </w:tc>
+        <w:tc>
+          <w:tcPr>
+            <w:tcW w:type="dxa" w:w="1922"/>
+          </w:tcPr>
+          <w:p>
+            <w:r>
+              <w:rPr>
+                <w:b w:val="0"/>
+                <w:i w:val="0"/>
+                <w:color w:val="2E6BA0"/>
+                <w:sz w:val="20"/>
+              </w:rPr>
+              <w:t>#93</w:t>
+            </w:r>
+          </w:p>
+        </w:tc>
+        <w:tc>
+          <w:tcPr>
+            <w:tcW w:type="dxa" w:w="5857"/>
+          </w:tcPr>
+          <w:p>
+            <w:r>
+              <w:rPr>
+                <w:b w:val="0"/>
+                <w:i w:val="0"/>
+                <w:color w:val="22303C"/>
+                <w:sz w:val="20"/>
+              </w:rPr>
+              <w:t>Complete multi-user card ownership</w:t>
+            </w:r>
+          </w:p>
+        </w:tc>
+      </w:tr>
+      <w:tr>
+        <w:tc>
+          <w:tcPr>
+            <w:tcW w:type="dxa" w:w="2013"/>
+          </w:tcPr>
+          <w:p>
+            <w:r>
+              <w:rPr>
+                <w:b w:val="0"/>
+                <w:i w:val="0"/>
+                <w:color w:val="22303C"/>
+                <w:sz w:val="20"/>
+              </w:rPr>
+              <w:t>kuantorflow</w:t>
+            </w:r>
+          </w:p>
+        </w:tc>
+        <w:tc>
+          <w:tcPr>
+            <w:tcW w:type="dxa" w:w="1922"/>
+          </w:tcPr>
+          <w:p>
+            <w:r>
+              <w:rPr>
+                <w:b w:val="0"/>
+                <w:i w:val="0"/>
+                <w:color w:val="2E6BA0"/>
+                <w:sz w:val="20"/>
+              </w:rPr>
+              <w:t>#125</w:t>
+            </w:r>
+          </w:p>
+        </w:tc>
+        <w:tc>
+          <w:tcPr>
+            <w:tcW w:type="dxa" w:w="5857"/>
+          </w:tcPr>
+          <w:p>
+            <w:r>
+              <w:rPr>
+                <w:b w:val="0"/>
+                <w:i w:val="0"/>
+                <w:color w:val="22303C"/>
+                <w:sz w:val="20"/>
+              </w:rPr>
+              <w:t>Deny unauthorized users to add/change/delete words</w:t>
+            </w:r>
+          </w:p>
+        </w:tc>
+      </w:tr>
+      <w:tr>
+        <w:tc>
+          <w:tcPr>
+            <w:tcW w:type="dxa" w:w="2013"/>
+          </w:tcPr>
+          <w:p>
+            <w:r>
+              <w:rPr>
+                <w:b w:val="0"/>
+                <w:i w:val="0"/>
+                <w:color w:val="22303C"/>
+                <w:sz w:val="20"/>
+              </w:rPr>
+              <w:t>kuantorflow</w:t>
+            </w:r>
+          </w:p>
+        </w:tc>
+        <w:tc>
+          <w:tcPr>
+            <w:tcW w:type="dxa" w:w="1922"/>
+          </w:tcPr>
+          <w:p>
+            <w:r>
+              <w:rPr>
+                <w:b w:val="0"/>
+                <w:i w:val="0"/>
+                <w:color w:val="2E6BA0"/>
+                <w:sz w:val="20"/>
+              </w:rPr>
+              <w:t>#126</w:t>
+            </w:r>
+          </w:p>
+        </w:tc>
+        <w:tc>
+          <w:tcPr>
+            <w:tcW w:type="dxa" w:w="5857"/>
+          </w:tcPr>
+          <w:p>
+            <w:r>
+              <w:rPr>
+                <w:b w:val="0"/>
+                <w:i w:val="0"/>
+                <w:color w:val="22303C"/>
+                <w:sz w:val="20"/>
+              </w:rPr>
+              <w:t>Blacklist file for blocking users</w:t>
+            </w:r>
+          </w:p>
+        </w:tc>
+      </w:tr>
+      <w:tr>
+        <w:tc>
+          <w:tcPr>
+            <w:tcW w:type="dxa" w:w="2013"/>
+          </w:tcPr>
+          <w:p>
+            <w:r>
+              <w:rPr>
+                <w:b w:val="0"/>
+                <w:i w:val="0"/>
+                <w:color w:val="22303C"/>
+                <w:sz w:val="20"/>
+              </w:rPr>
+              <w:t>kuantorflow</w:t>
+            </w:r>
+          </w:p>
+        </w:tc>
+        <w:tc>
+          <w:tcPr>
+            <w:tcW w:type="dxa" w:w="1922"/>
+          </w:tcPr>
+          <w:p>
+            <w:r>
+              <w:rPr>
+                <w:b w:val="0"/>
+                <w:i w:val="0"/>
+                <w:color w:val="2E6BA0"/>
+                <w:sz w:val="20"/>
+              </w:rPr>
+              <w:t>#127</w:t>
+            </w:r>
+          </w:p>
+        </w:tc>
+        <w:tc>
+          <w:tcPr>
+            <w:tcW w:type="dxa" w:w="5857"/>
+          </w:tcPr>
+          <w:p>
+            <w:r>
+              <w:rPr>
+                <w:b w:val="0"/>
+                <w:i w:val="0"/>
+                <w:color w:val="22303C"/>
+                <w:sz w:val="20"/>
+              </w:rPr>
+              <w:t>Create "Individual" cards mode</w:t>
+            </w:r>
+          </w:p>
+        </w:tc>
+      </w:tr>
+      <w:tr>
+        <w:tc>
+          <w:tcPr>
+            <w:tcW w:type="dxa" w:w="2013"/>
+          </w:tcPr>
+          <w:p>
+            <w:r>
+              <w:rPr>
+                <w:b w:val="0"/>
+                <w:i w:val="0"/>
+                <w:color w:val="22303C"/>
+                <w:sz w:val="20"/>
+              </w:rPr>
+              <w:t>kuantorflow</w:t>
+            </w:r>
+          </w:p>
+        </w:tc>
+        <w:tc>
+          <w:tcPr>
+            <w:tcW w:type="dxa" w:w="1922"/>
+          </w:tcPr>
+          <w:p>
+            <w:r>
+              <w:rPr>
+                <w:b w:val="0"/>
+                <w:i w:val="0"/>
+                <w:color w:val="2E6BA0"/>
+                <w:sz w:val="20"/>
+              </w:rPr>
+              <w:t>#129</w:t>
+            </w:r>
+          </w:p>
+        </w:tc>
+        <w:tc>
+          <w:tcPr>
+            <w:tcW w:type="dxa" w:w="5857"/>
+          </w:tcPr>
+          <w:p>
+            <w:r>
+              <w:rPr>
+                <w:b w:val="0"/>
+                <w:i w:val="0"/>
+                <w:color w:val="22303C"/>
+                <w:sz w:val="20"/>
+              </w:rPr>
+              <w:t>Smart word-manipulation techniques for exercises (spike)</w:t>
+            </w:r>
+          </w:p>
+        </w:tc>
+      </w:tr>
+      <w:tr>
+        <w:tc>
+          <w:tcPr>
+            <w:tcW w:type="dxa" w:w="2013"/>
+          </w:tcPr>
+          <w:p>
+            <w:r>
+              <w:rPr>
+                <w:b w:val="0"/>
+                <w:i w:val="0"/>
+                <w:color w:val="22303C"/>
+                <w:sz w:val="20"/>
+              </w:rPr>
+              <w:t>kuantorflow</w:t>
+            </w:r>
+          </w:p>
+        </w:tc>
+        <w:tc>
+          <w:tcPr>
+            <w:tcW w:type="dxa" w:w="1922"/>
+          </w:tcPr>
+          <w:p>
+            <w:r>
+              <w:rPr>
+                <w:b w:val="0"/>
+                <w:i w:val="0"/>
+                <w:color w:val="2E6BA0"/>
+                <w:sz w:val="20"/>
+              </w:rPr>
+              <w:t>#136</w:t>
+            </w:r>
+          </w:p>
+        </w:tc>
+        <w:tc>
+          <w:tcPr>
+            <w:tcW w:type="dxa" w:w="5857"/>
+          </w:tcPr>
+          <w:p>
+            <w:r>
+              <w:rPr>
+                <w:b w:val="0"/>
+                <w:i w:val="0"/>
+                <w:color w:val="22303C"/>
+                <w:sz w:val="20"/>
+              </w:rPr>
+              <w:t>Images on flashcards (files on disk, path in MySQL)</w:t>
+            </w:r>
+          </w:p>
+        </w:tc>
+      </w:tr>
+      <w:tr>
+        <w:tc>
+          <w:tcPr>
+            <w:tcW w:type="dxa" w:w="2013"/>
+          </w:tcPr>
+          <w:p>
+            <w:r>
+              <w:rPr>
+                <w:b w:val="0"/>
+                <w:i w:val="0"/>
+                <w:color w:val="22303C"/>
+                <w:sz w:val="20"/>
+              </w:rPr>
+              <w:t>kuantorflow</w:t>
+            </w:r>
+          </w:p>
+        </w:tc>
+        <w:tc>
+          <w:tcPr>
+            <w:tcW w:type="dxa" w:w="1922"/>
+          </w:tcPr>
+          <w:p>
+            <w:r>
+              <w:rPr>
+                <w:b w:val="0"/>
+                <w:i w:val="0"/>
+                <w:color w:val="2E6BA0"/>
+                <w:sz w:val="20"/>
+              </w:rPr>
+              <w:t>#139</w:t>
+            </w:r>
+          </w:p>
+        </w:tc>
+        <w:tc>
+          <w:tcPr>
+            <w:tcW w:type="dxa" w:w="5857"/>
+          </w:tcPr>
+          <w:p>
+            <w:r>
+              <w:rPr>
+                <w:b w:val="0"/>
+                <w:i w:val="0"/>
+                <w:color w:val="22303C"/>
+                <w:sz w:val="20"/>
+              </w:rPr>
+              <w:t>Delete-word request to the admin</w:t>
+            </w:r>
+          </w:p>
+        </w:tc>
+      </w:tr>
+      <w:tr>
+        <w:tc>
+          <w:tcPr>
+            <w:tcW w:type="dxa" w:w="2013"/>
+          </w:tcPr>
+          <w:p>
+            <w:r>
+              <w:rPr>
+                <w:b w:val="0"/>
+                <w:i w:val="0"/>
+                <w:color w:val="22303C"/>
+                <w:sz w:val="20"/>
+              </w:rPr>
+              <w:t>kuantorflow</w:t>
+            </w:r>
+          </w:p>
+        </w:tc>
+        <w:tc>
+          <w:tcPr>
+            <w:tcW w:type="dxa" w:w="1922"/>
+          </w:tcPr>
+          <w:p>
+            <w:r>
+              <w:rPr>
+                <w:b w:val="0"/>
+                <w:i w:val="0"/>
+                <w:color w:val="2E6BA0"/>
+                <w:sz w:val="20"/>
+              </w:rPr>
+              <w:t>#85</w:t>
+            </w:r>
+          </w:p>
+        </w:tc>
+        <w:tc>
+          <w:tcPr>
+            <w:tcW w:type="dxa" w:w="5857"/>
+          </w:tcPr>
+          <w:p>
+            <w:r>
+              <w:rPr>
+                <w:b w:val="0"/>
+                <w:i w:val="0"/>
+                <w:color w:val="22303C"/>
+                <w:sz w:val="20"/>
+              </w:rPr>
+              <w:t>Full-screen widget mode with visible maximize button</w:t>
+            </w:r>
+          </w:p>
+        </w:tc>
+      </w:tr>
+      <w:tr>
+        <w:tc>
+          <w:tcPr>
+            <w:tcW w:type="dxa" w:w="2013"/>
+          </w:tcPr>
+          <w:p>
+            <w:r>
+              <w:rPr>
+                <w:b w:val="0"/>
+                <w:i w:val="0"/>
+                <w:color w:val="22303C"/>
+                <w:sz w:val="20"/>
+              </w:rPr>
+              <w:t>kuantorflow</w:t>
+            </w:r>
+          </w:p>
+        </w:tc>
+        <w:tc>
+          <w:tcPr>
+            <w:tcW w:type="dxa" w:w="1922"/>
+          </w:tcPr>
+          <w:p>
+            <w:r>
+              <w:rPr>
+                <w:b w:val="0"/>
+                <w:i w:val="0"/>
+                <w:color w:val="2E6BA0"/>
+                <w:sz w:val="20"/>
+              </w:rPr>
+              <w:t>#88</w:t>
+            </w:r>
+            <w:r>
+              <w:rPr>
+                <w:b w:val="0"/>
+                <w:i w:val="0"/>
+                <w:color w:val="22303C"/>
+                <w:sz w:val="20"/>
+              </w:rPr>
+              <w:t xml:space="preserve"> / </w:t>
+            </w:r>
+            <w:r>
+              <w:rPr>
+                <w:b w:val="0"/>
+                <w:i w:val="0"/>
+                <w:color w:val="2E6BA0"/>
+                <w:sz w:val="20"/>
+              </w:rPr>
+              <w:t>#89</w:t>
+            </w:r>
+            <w:r>
+              <w:rPr>
+                <w:b w:val="0"/>
+                <w:i w:val="0"/>
+                <w:color w:val="22303C"/>
+                <w:sz w:val="20"/>
+              </w:rPr>
+              <w:t xml:space="preserve"> / </w:t>
+            </w:r>
+            <w:r>
+              <w:rPr>
+                <w:b w:val="0"/>
+                <w:i w:val="0"/>
+                <w:color w:val="2E6BA0"/>
+                <w:sz w:val="20"/>
+              </w:rPr>
+              <w:t>#90</w:t>
+            </w:r>
+          </w:p>
+        </w:tc>
+        <w:tc>
+          <w:tcPr>
+            <w:tcW w:type="dxa" w:w="5857"/>
+          </w:tcPr>
+          <w:p>
+            <w:r>
+              <w:rPr>
+                <w:b w:val="0"/>
+                <w:i w:val="0"/>
+                <w:color w:val="22303C"/>
+                <w:sz w:val="20"/>
+              </w:rPr>
+              <w:t>Backup docs / added-by field / logs disclosure</w:t>
+            </w:r>
+          </w:p>
+        </w:tc>
+      </w:tr>
+      <w:tr>
+        <w:tc>
+          <w:tcPr>
+            <w:tcW w:type="dxa" w:w="2013"/>
+          </w:tcPr>
+          <w:p>
+            <w:r>
+              <w:rPr>
+                <w:b w:val="0"/>
+                <w:i w:val="0"/>
+                <w:color w:val="22303C"/>
+                <w:sz w:val="20"/>
+              </w:rPr>
+              <w:t>kuantorflow</w:t>
+            </w:r>
+          </w:p>
+        </w:tc>
+        <w:tc>
+          <w:tcPr>
+            <w:tcW w:type="dxa" w:w="1922"/>
+          </w:tcPr>
+          <w:p>
+            <w:r>
+              <w:rPr>
+                <w:b w:val="0"/>
+                <w:i w:val="0"/>
+                <w:color w:val="2E6BA0"/>
+                <w:sz w:val="20"/>
+              </w:rPr>
+              <w:t>#99</w:t>
+            </w:r>
+            <w:r>
+              <w:rPr>
+                <w:b w:val="0"/>
+                <w:i w:val="0"/>
+                <w:color w:val="22303C"/>
+                <w:sz w:val="20"/>
+              </w:rPr>
+              <w:t xml:space="preserve"> / </w:t>
+            </w:r>
+            <w:r>
+              <w:rPr>
+                <w:b w:val="0"/>
+                <w:i w:val="0"/>
+                <w:color w:val="2E6BA0"/>
+                <w:sz w:val="20"/>
+              </w:rPr>
+              <w:t>#104</w:t>
+            </w:r>
+          </w:p>
+        </w:tc>
+        <w:tc>
+          <w:tcPr>
+            <w:tcW w:type="dxa" w:w="5857"/>
+          </w:tcPr>
+          <w:p>
+            <w:r>
+              <w:rPr>
+                <w:b w:val="0"/>
+                <w:i w:val="0"/>
+                <w:color w:val="22303C"/>
+                <w:sz w:val="20"/>
+              </w:rPr>
+              <w:t>API-credits message / Allura welcome font</w:t>
+            </w:r>
+          </w:p>
+        </w:tc>
+      </w:tr>
+      <w:tr>
+        <w:tc>
+          <w:tcPr>
+            <w:tcW w:type="dxa" w:w="2013"/>
+          </w:tcPr>
+          <w:p>
+            <w:r>
+              <w:rPr>
+                <w:b w:val="0"/>
+                <w:i w:val="0"/>
+                <w:color w:val="22303C"/>
+                <w:sz w:val="20"/>
+              </w:rPr>
+              <w:t>ai_agent</w:t>
+            </w:r>
+          </w:p>
+        </w:tc>
+        <w:tc>
+          <w:tcPr>
+            <w:tcW w:type="dxa" w:w="1922"/>
+          </w:tcPr>
+          <w:p>
+            <w:r>
+              <w:rPr>
+                <w:b w:val="0"/>
+                <w:i w:val="0"/>
+                <w:color w:val="2E6BA0"/>
+                <w:sz w:val="20"/>
+              </w:rPr>
+              <w:t>#51</w:t>
+            </w:r>
+            <w:r>
+              <w:rPr>
+                <w:b w:val="0"/>
+                <w:i w:val="0"/>
+                <w:color w:val="22303C"/>
+                <w:sz w:val="20"/>
+              </w:rPr>
+              <w:t xml:space="preserve"> / </w:t>
+            </w:r>
+            <w:r>
+              <w:rPr>
+                <w:b w:val="0"/>
+                <w:i w:val="0"/>
+                <w:color w:val="2E6BA0"/>
+                <w:sz w:val="20"/>
+              </w:rPr>
+              <w:t>#56</w:t>
+            </w:r>
+            <w:r>
+              <w:rPr>
+                <w:b w:val="0"/>
+                <w:i w:val="0"/>
+                <w:color w:val="22303C"/>
+                <w:sz w:val="20"/>
+              </w:rPr>
+              <w:t xml:space="preserve"> / </w:t>
+            </w:r>
+            <w:r>
+              <w:rPr>
+                <w:b w:val="0"/>
+                <w:i w:val="0"/>
+                <w:color w:val="2E6BA0"/>
+                <w:sz w:val="20"/>
+              </w:rPr>
+              <w:t>#57</w:t>
+            </w:r>
+            <w:r>
+              <w:rPr>
+                <w:b w:val="0"/>
+                <w:i w:val="0"/>
+                <w:color w:val="22303C"/>
+                <w:sz w:val="20"/>
+              </w:rPr>
+              <w:t xml:space="preserve"> / </w:t>
+            </w:r>
+            <w:r>
+              <w:rPr>
+                <w:b w:val="0"/>
+                <w:i w:val="0"/>
+                <w:color w:val="2E6BA0"/>
+                <w:sz w:val="20"/>
+              </w:rPr>
+              <w:t>#58</w:t>
+            </w:r>
+          </w:p>
+        </w:tc>
+        <w:tc>
+          <w:tcPr>
+            <w:tcW w:type="dxa" w:w="5857"/>
+          </w:tcPr>
+          <w:p>
+            <w:r>
+              <w:rPr>
+                <w:b w:val="0"/>
+                <w:i w:val="0"/>
+                <w:color w:val="22303C"/>
+                <w:sz w:val="20"/>
+              </w:rPr>
+              <w:t>Nicknames / bigger avatar / add-card confirm / save conversation</w:t>
+            </w:r>
+          </w:p>
+        </w:tc>
+      </w:tr>
+      <w:tr>
+        <w:tc>
+          <w:tcPr>
+            <w:tcW w:type="dxa" w:w="2013"/>
+          </w:tcPr>
+          <w:p>
+            <w:r>
+              <w:rPr>
+                <w:b w:val="0"/>
+                <w:i w:val="0"/>
+                <w:color w:val="22303C"/>
+                <w:sz w:val="20"/>
+              </w:rPr>
+              <w:t>kuantorflow_automation</w:t>
+            </w:r>
+          </w:p>
+        </w:tc>
+        <w:tc>
+          <w:tcPr>
+            <w:tcW w:type="dxa" w:w="1922"/>
+          </w:tcPr>
+          <w:p>
+            <w:r>
+              <w:rPr>
+                <w:b w:val="0"/>
+                <w:i w:val="0"/>
+                <w:color w:val="2E6BA0"/>
+                <w:sz w:val="20"/>
+              </w:rPr>
+              <w:t>#4</w:t>
+            </w:r>
+          </w:p>
+        </w:tc>
+        <w:tc>
+          <w:tcPr>
+            <w:tcW w:type="dxa" w:w="5857"/>
+          </w:tcPr>
+          <w:p>
+            <w:r>
+              <w:rPr>
+                <w:b w:val="0"/>
+                <w:i w:val="0"/>
+                <w:color w:val="22303C"/>
+                <w:sz w:val="20"/>
+              </w:rPr>
+              <w:t>Basic automated tests for the Mykola AI agent</w:t>
+            </w:r>
+          </w:p>
+        </w:tc>
+      </w:tr>
+    </w:tbl>
+    <w:p>
+      <w:pPr>
+        <w:spacing w:after="40"/>
+      </w:pPr>
+    </w:p>
+    <w:p>
+      <w:pPr>
+        <w:pStyle w:val="Heading2"/>
+      </w:pPr>
+      <w:r>
+        <w:rPr>
+          <w:b w:val="0"/>
+          <w:i w:val="0"/>
+          <w:color w:val="22303C"/>
+          <w:sz w:val="25"/>
+        </w:rPr>
+        <w:t>In Progress — a new "word games" cluster</w:t>
+      </w:r>
+    </w:p>
+    <w:tbl>
+      <w:tblPr>
+        <w:tblStyle w:val="TableGrid"/>
+        <w:tblW w:type="auto" w:w="0"/>
+        <w:jc w:val="left"/>
+        <w:tblLayout w:type="fixed"/>
+        <w:tblLook w:firstColumn="1" w:firstRow="1" w:lastColumn="0" w:lastRow="0" w:noHBand="0" w:noVBand="1" w:val="04A0"/>
+      </w:tblPr>
+      <w:tblGrid>
+        <w:gridCol w:w="3283"/>
+        <w:gridCol w:w="3283"/>
+        <w:gridCol w:w="3283"/>
+      </w:tblGrid>
+      <w:tr>
+        <w:tc>
+          <w:tcPr>
+            <w:tcW w:type="dxa" w:w="1399"/>
+            <w:shd w:val="clear" w:fill="2E6BA0"/>
+          </w:tcPr>
+          <w:p>
+            <w:r>
+              <w:rPr>
+                <w:b/>
+                <w:i w:val="0"/>
+                <w:color w:val="FFFFFF"/>
+                <w:sz w:val="20"/>
+              </w:rPr>
+              <w:t>Repo</w:t>
+            </w:r>
+          </w:p>
+        </w:tc>
+        <w:tc>
+          <w:tcPr>
+            <w:tcW w:type="dxa" w:w="792"/>
+            <w:shd w:val="clear" w:fill="2E6BA0"/>
+          </w:tcPr>
+          <w:p>
+            <w:r>
+              <w:rPr>
+                <w:b/>
+                <w:i w:val="0"/>
+                <w:color w:val="FFFFFF"/>
+                <w:sz w:val="20"/>
+              </w:rPr>
+              <w:t>Issue</w:t>
+            </w:r>
+          </w:p>
+        </w:tc>
+        <w:tc>
+          <w:tcPr>
+            <w:tcW w:type="dxa" w:w="7757"/>
+            <w:shd w:val="clear" w:fill="2E6BA0"/>
+          </w:tcPr>
+          <w:p>
+            <w:r>
+              <w:rPr>
+                <w:b/>
+                <w:i w:val="0"/>
+                <w:color w:val="FFFFFF"/>
+                <w:sz w:val="20"/>
+              </w:rPr>
+              <w:t>Title</w:t>
+            </w:r>
+          </w:p>
+        </w:tc>
+      </w:tr>
+      <w:tr>
+        <w:tc>
+          <w:tcPr>
+            <w:tcW w:type="dxa" w:w="1399"/>
+          </w:tcPr>
+          <w:p>
+            <w:r>
+              <w:rPr>
+                <w:b w:val="0"/>
+                <w:i w:val="0"/>
+                <w:color w:val="22303C"/>
+                <w:sz w:val="20"/>
+              </w:rPr>
+              <w:t>kuantorflow</w:t>
+            </w:r>
+          </w:p>
+        </w:tc>
+        <w:tc>
+          <w:tcPr>
+            <w:tcW w:type="dxa" w:w="792"/>
+          </w:tcPr>
+          <w:p>
+            <w:r>
+              <w:rPr>
+                <w:b w:val="0"/>
+                <w:i w:val="0"/>
+                <w:color w:val="2E6BA0"/>
+                <w:sz w:val="20"/>
+              </w:rPr>
+              <w:t>#130</w:t>
+            </w:r>
+          </w:p>
+        </w:tc>
+        <w:tc>
+          <w:tcPr>
+            <w:tcW w:type="dxa" w:w="7757"/>
+          </w:tcPr>
+          <w:p>
+            <w:r>
+              <w:rPr>
+                <w:b w:val="0"/>
+                <w:i w:val="0"/>
+                <w:color w:val="22303C"/>
+                <w:sz w:val="20"/>
+              </w:rPr>
+              <w:t>Levenshtein multiple-choice translation game</w:t>
+            </w:r>
+          </w:p>
+        </w:tc>
+      </w:tr>
+      <w:tr>
+        <w:tc>
+          <w:tcPr>
+            <w:tcW w:type="dxa" w:w="1399"/>
+          </w:tcPr>
+          <w:p>
+            <w:r>
+              <w:rPr>
+                <w:b w:val="0"/>
+                <w:i w:val="0"/>
+                <w:color w:val="22303C"/>
+                <w:sz w:val="20"/>
+              </w:rPr>
+              <w:t>kuantorflow</w:t>
+            </w:r>
+          </w:p>
+        </w:tc>
+        <w:tc>
+          <w:tcPr>
+            <w:tcW w:type="dxa" w:w="792"/>
+          </w:tcPr>
+          <w:p>
+            <w:r>
+              <w:rPr>
+                <w:b w:val="0"/>
+                <w:i w:val="0"/>
+                <w:color w:val="2E6BA0"/>
+                <w:sz w:val="20"/>
+              </w:rPr>
+              <w:t>#131</w:t>
+            </w:r>
+          </w:p>
+        </w:tc>
+        <w:tc>
+          <w:tcPr>
+            <w:tcW w:type="dxa" w:w="7757"/>
+          </w:tcPr>
+          <w:p>
+            <w:r>
+              <w:rPr>
+                <w:b w:val="0"/>
+                <w:i w:val="0"/>
+                <w:color w:val="22303C"/>
+                <w:sz w:val="20"/>
+              </w:rPr>
+              <w:t>Keyboard-adjacency typo distractors (MCQ)</w:t>
+            </w:r>
+          </w:p>
+        </w:tc>
+      </w:tr>
+      <w:tr>
+        <w:tc>
+          <w:tcPr>
+            <w:tcW w:type="dxa" w:w="1399"/>
+          </w:tcPr>
+          <w:p>
+            <w:r>
+              <w:rPr>
+                <w:b w:val="0"/>
+                <w:i w:val="0"/>
+                <w:color w:val="22303C"/>
+                <w:sz w:val="20"/>
+              </w:rPr>
+              <w:t>kuantorflow</w:t>
+            </w:r>
+          </w:p>
+        </w:tc>
+        <w:tc>
+          <w:tcPr>
+            <w:tcW w:type="dxa" w:w="792"/>
+          </w:tcPr>
+          <w:p>
+            <w:r>
+              <w:rPr>
+                <w:b w:val="0"/>
+                <w:i w:val="0"/>
+                <w:color w:val="2E6BA0"/>
+                <w:sz w:val="20"/>
+              </w:rPr>
+              <w:t>#132</w:t>
+            </w:r>
+          </w:p>
+        </w:tc>
+        <w:tc>
+          <w:tcPr>
+            <w:tcW w:type="dxa" w:w="7757"/>
+          </w:tcPr>
+          <w:p>
+            <w:r>
+              <w:rPr>
+                <w:b w:val="0"/>
+                <w:i w:val="0"/>
+                <w:color w:val="22303C"/>
+                <w:sz w:val="20"/>
+              </w:rPr>
+              <w:t>"Is this a real word?" (n-gram pseudowords)</w:t>
+            </w:r>
+          </w:p>
+        </w:tc>
+      </w:tr>
+      <w:tr>
+        <w:tc>
+          <w:tcPr>
+            <w:tcW w:type="dxa" w:w="1399"/>
+          </w:tcPr>
+          <w:p>
+            <w:r>
+              <w:rPr>
+                <w:b w:val="0"/>
+                <w:i w:val="0"/>
+                <w:color w:val="22303C"/>
+                <w:sz w:val="20"/>
+              </w:rPr>
+              <w:t>kuantorflow</w:t>
+            </w:r>
+          </w:p>
+        </w:tc>
+        <w:tc>
+          <w:tcPr>
+            <w:tcW w:type="dxa" w:w="792"/>
+          </w:tcPr>
+          <w:p>
+            <w:r>
+              <w:rPr>
+                <w:b w:val="0"/>
+                <w:i w:val="0"/>
+                <w:color w:val="2E6BA0"/>
+                <w:sz w:val="20"/>
+              </w:rPr>
+              <w:t>#133</w:t>
+            </w:r>
+          </w:p>
+        </w:tc>
+        <w:tc>
+          <w:tcPr>
+            <w:tcW w:type="dxa" w:w="7757"/>
+          </w:tcPr>
+          <w:p>
+            <w:r>
+              <w:rPr>
+                <w:b w:val="0"/>
+                <w:i w:val="0"/>
+                <w:color w:val="22303C"/>
+                <w:sz w:val="20"/>
+              </w:rPr>
+              <w:t>Typoglycemia scrambling mode</w:t>
+            </w:r>
+          </w:p>
+        </w:tc>
+      </w:tr>
+      <w:tr>
+        <w:tc>
+          <w:tcPr>
+            <w:tcW w:type="dxa" w:w="1399"/>
+          </w:tcPr>
+          <w:p>
+            <w:r>
+              <w:rPr>
+                <w:b w:val="0"/>
+                <w:i w:val="0"/>
+                <w:color w:val="22303C"/>
+                <w:sz w:val="20"/>
+              </w:rPr>
+              <w:t>kuantorflow</w:t>
+            </w:r>
+          </w:p>
+        </w:tc>
+        <w:tc>
+          <w:tcPr>
+            <w:tcW w:type="dxa" w:w="792"/>
+          </w:tcPr>
+          <w:p>
+            <w:r>
+              <w:rPr>
+                <w:b w:val="0"/>
+                <w:i w:val="0"/>
+                <w:color w:val="2E6BA0"/>
+                <w:sz w:val="20"/>
+              </w:rPr>
+              <w:t>#110</w:t>
+            </w:r>
+          </w:p>
+        </w:tc>
+        <w:tc>
+          <w:tcPr>
+            <w:tcW w:type="dxa" w:w="7757"/>
+          </w:tcPr>
+          <w:p>
+            <w:r>
+              <w:rPr>
+                <w:b w:val="0"/>
+                <w:i w:val="0"/>
+                <w:color w:val="22303C"/>
+                <w:sz w:val="20"/>
+              </w:rPr>
+              <w:t>Investigation: Learner's vs Collegiate dictionary (+ M-W API)</w:t>
+            </w:r>
+          </w:p>
+        </w:tc>
+      </w:tr>
+    </w:tbl>
+    <w:p>
+      <w:pPr>
+        <w:spacing w:after="40"/>
+      </w:pPr>
+    </w:p>
+    <w:p>
+      <w:pPr>
+        <w:pStyle w:val="Heading2"/>
+      </w:pPr>
+      <w:r>
+        <w:rPr>
+          <w:b w:val="0"/>
+          <w:i w:val="0"/>
+          <w:color w:val="22303C"/>
+          <w:sz w:val="25"/>
+        </w:rPr>
+        <w:t>Todo (selected)</w:t>
+      </w:r>
+    </w:p>
+    <w:tbl>
+      <w:tblPr>
+        <w:tblStyle w:val="TableGrid"/>
+        <w:tblW w:type="auto" w:w="0"/>
+        <w:jc w:val="left"/>
+        <w:tblLayout w:type="fixed"/>
+        <w:tblLook w:firstColumn="1" w:firstRow="1" w:lastColumn="0" w:lastRow="0" w:noHBand="0" w:noVBand="1" w:val="04A0"/>
+      </w:tblPr>
+      <w:tblGrid>
+        <w:gridCol w:w="3283"/>
+        <w:gridCol w:w="3283"/>
+        <w:gridCol w:w="3283"/>
+      </w:tblGrid>
+      <w:tr>
+        <w:tc>
+          <w:tcPr>
             <w:tcW w:type="dxa" w:w="1088"/>
+            <w:shd w:val="clear" w:fill="2E6BA0"/>
+          </w:tcPr>
+          <w:p>
+            <w:r>
+              <w:rPr>
+                <w:b/>
+                <w:i w:val="0"/>
+                <w:color w:val="FFFFFF"/>
+                <w:sz w:val="20"/>
+              </w:rPr>
+              <w:t>Repo</w:t>
+            </w:r>
+          </w:p>
+        </w:tc>
+        <w:tc>
+          <w:tcPr>
+            <w:tcW w:type="dxa" w:w="2077"/>
+            <w:shd w:val="clear" w:fill="2E6BA0"/>
+          </w:tcPr>
+          <w:p>
+            <w:r>
+              <w:rPr>
+                <w:b/>
+                <w:i w:val="0"/>
+                <w:color w:val="FFFFFF"/>
+                <w:sz w:val="20"/>
+              </w:rPr>
+              <w:t>Issue</w:t>
+            </w:r>
+          </w:p>
+        </w:tc>
+        <w:tc>
+          <w:tcPr>
+            <w:tcW w:type="dxa" w:w="6627"/>
+            <w:shd w:val="clear" w:fill="2E6BA0"/>
+          </w:tcPr>
+          <w:p>
+            <w:r>
+              <w:rPr>
+                <w:b/>
+                <w:i w:val="0"/>
+                <w:color w:val="FFFFFF"/>
+                <w:sz w:val="20"/>
+              </w:rPr>
+              <w:t>Title</w:t>
+            </w:r>
+          </w:p>
+        </w:tc>
+      </w:tr>
+      <w:tr>
+        <w:tc>
+          <w:tcPr>
+            <w:tcW w:type="dxa" w:w="1088"/>
+          </w:tcPr>
+          <w:p>
+            <w:r>
+              <w:rPr>
+                <w:b w:val="0"/>
+                <w:i w:val="0"/>
+                <w:color w:val="22303C"/>
+                <w:sz w:val="20"/>
+              </w:rPr>
+              <w:t>kuantorflow</w:t>
+            </w:r>
+          </w:p>
+        </w:tc>
+        <w:tc>
+          <w:tcPr>
+            <w:tcW w:type="dxa" w:w="2077"/>
+          </w:tcPr>
+          <w:p>
+            <w:r>
+              <w:rPr>
+                <w:b w:val="0"/>
+                <w:i w:val="0"/>
+                <w:color w:val="2E6BA0"/>
+                <w:sz w:val="20"/>
+              </w:rPr>
+              <w:t>#74</w:t>
+            </w:r>
+          </w:p>
+        </w:tc>
+        <w:tc>
+          <w:tcPr>
+            <w:tcW w:type="dxa" w:w="6627"/>
+          </w:tcPr>
+          <w:p>
+            <w:r>
+              <w:rPr>
+                <w:b w:val="0"/>
+                <w:i w:val="0"/>
+                <w:color w:val="22303C"/>
+                <w:sz w:val="20"/>
+              </w:rPr>
+              <w:t>Dark theme for the website</w:t>
+            </w:r>
+          </w:p>
+        </w:tc>
+      </w:tr>
+      <w:tr>
+        <w:tc>
+          <w:tcPr>
+            <w:tcW w:type="dxa" w:w="1088"/>
+          </w:tcPr>
+          <w:p>
+            <w:r>
+              <w:rPr>
+                <w:b w:val="0"/>
+                <w:i w:val="0"/>
+                <w:color w:val="22303C"/>
+                <w:sz w:val="20"/>
+              </w:rPr>
+              <w:t>kuantorflow</w:t>
+            </w:r>
+          </w:p>
+        </w:tc>
+        <w:tc>
+          <w:tcPr>
+            <w:tcW w:type="dxa" w:w="2077"/>
+          </w:tcPr>
+          <w:p>
+            <w:r>
+              <w:rPr>
+                <w:b w:val="0"/>
+                <w:i w:val="0"/>
+                <w:color w:val="2E6BA0"/>
+                <w:sz w:val="20"/>
+              </w:rPr>
+              <w:t>#25</w:t>
+            </w:r>
+          </w:p>
+        </w:tc>
+        <w:tc>
+          <w:tcPr>
+            <w:tcW w:type="dxa" w:w="6627"/>
+          </w:tcPr>
+          <w:p>
+            <w:r>
+              <w:rPr>
+                <w:b w:val="0"/>
+                <w:i w:val="0"/>
+                <w:color w:val="22303C"/>
+                <w:sz w:val="20"/>
+              </w:rPr>
+              <w:t>Export/import cards (local ↔ remote DB)</w:t>
+            </w:r>
+          </w:p>
+        </w:tc>
+      </w:tr>
+      <w:tr>
+        <w:tc>
+          <w:tcPr>
+            <w:tcW w:type="dxa" w:w="1088"/>
+          </w:tcPr>
+          <w:p>
+            <w:r>
+              <w:rPr>
+                <w:b w:val="0"/>
+                <w:i w:val="0"/>
+                <w:color w:val="22303C"/>
+                <w:sz w:val="20"/>
+              </w:rPr>
+              <w:t>kuantorflow</w:t>
+            </w:r>
+          </w:p>
+        </w:tc>
+        <w:tc>
+          <w:tcPr>
+            <w:tcW w:type="dxa" w:w="2077"/>
+          </w:tcPr>
+          <w:p>
+            <w:r>
+              <w:rPr>
+                <w:b w:val="0"/>
+                <w:i w:val="0"/>
+                <w:color w:val="2E6BA0"/>
+                <w:sz w:val="20"/>
+              </w:rPr>
+              <w:t>#148</w:t>
+            </w:r>
+          </w:p>
+        </w:tc>
+        <w:tc>
+          <w:tcPr>
+            <w:tcW w:type="dxa" w:w="6627"/>
+          </w:tcPr>
+          <w:p>
+            <w:r>
+              <w:rPr>
+                <w:b w:val="0"/>
+                <w:i w:val="0"/>
+                <w:color w:val="22303C"/>
+                <w:sz w:val="20"/>
+              </w:rPr>
+              <w:t>IDs for users</w:t>
+            </w:r>
+          </w:p>
+        </w:tc>
+      </w:tr>
+      <w:tr>
+        <w:tc>
+          <w:tcPr>
+            <w:tcW w:type="dxa" w:w="1088"/>
+          </w:tcPr>
+          <w:p>
+            <w:r>
+              <w:rPr>
+                <w:b w:val="0"/>
+                <w:i w:val="0"/>
+                <w:color w:val="22303C"/>
+                <w:sz w:val="20"/>
+              </w:rPr>
+              <w:t>kuantorflow</w:t>
+            </w:r>
+          </w:p>
+        </w:tc>
+        <w:tc>
+          <w:tcPr>
+            <w:tcW w:type="dxa" w:w="2077"/>
           </w:tcPr>
           <w:p>
             <w:r>
@@ -3032,7 +3656,7 @@
         </w:tc>
         <w:tc>
           <w:tcPr>
-            <w:tcW w:type="dxa" w:w="7374"/>
+            <w:tcW w:type="dxa" w:w="6627"/>
           </w:tcPr>
           <w:p>
             <w:r>
@@ -3050,7 +3674,7 @@
       <w:tr>
         <w:tc>
           <w:tcPr>
-            <w:tcW w:type="dxa" w:w="1330"/>
+            <w:tcW w:type="dxa" w:w="1088"/>
           </w:tcPr>
           <w:p>
             <w:r>
@@ -3066,7 +3690,7 @@
         </w:tc>
         <w:tc>
           <w:tcPr>
-            <w:tcW w:type="dxa" w:w="1088"/>
+            <w:tcW w:type="dxa" w:w="2077"/>
           </w:tcPr>
           <w:p>
             <w:r>
@@ -3076,7 +3700,57 @@
                 <w:color w:val="2E6BA0"/>
                 <w:sz w:val="20"/>
               </w:rPr>
-              <w:t>#22</w:t>
+              <w:t>#140</w:t>
+            </w:r>
+          </w:p>
+        </w:tc>
+        <w:tc>
+          <w:tcPr>
+            <w:tcW w:type="dxa" w:w="6627"/>
+          </w:tcPr>
+          <w:p>
+            <w:r>
+              <w:rPr>
+                <w:b w:val="0"/>
+                <w:i w:val="0"/>
+                <w:color w:val="22303C"/>
+                <w:sz w:val="20"/>
+              </w:rPr>
+              <w:t>[Optional] Upload notes: support .pdf (text-layer)</w:t>
+            </w:r>
+          </w:p>
+        </w:tc>
+      </w:tr>
+      <w:tr>
+        <w:tc>
+          <w:tcPr>
+            <w:tcW w:type="dxa" w:w="1088"/>
+          </w:tcPr>
+          <w:p>
+            <w:r>
+              <w:rPr>
+                <w:b w:val="0"/>
+                <w:i w:val="0"/>
+                <w:color w:val="22303C"/>
+                <w:sz w:val="20"/>
+              </w:rPr>
+              <w:t>kuantorflow</w:t>
+            </w:r>
+          </w:p>
+        </w:tc>
+        <w:tc>
+          <w:tcPr>
+            <w:tcW w:type="dxa" w:w="2077"/>
+          </w:tcPr>
+          <w:p>
+            <w:r>
+              <w:rPr>
+                <w:b w:val="0"/>
+                <w:i w:val="0"/>
+                <w:color w:val="2E6BA0"/>
+                <w:sz w:val="20"/>
+              </w:rPr>
+              <w:t>#19</w:t>
             </w:r>
             <w:r>
               <w:rPr>
@@ -3094,13 +3768,49 @@
                 <w:color w:val="2E6BA0"/>
                 <w:sz w:val="20"/>
               </w:rPr>
-              <w:t>#74</w:t>
+              <w:t>#75</w:t>
+            </w:r>
+            <w:r>
+              <w:rPr>
+                <w:b w:val="0"/>
+                <w:i w:val="0"/>
+                <w:color w:val="22303C"/>
+                <w:sz w:val="20"/>
+              </w:rPr>
+              <w:t xml:space="preserve"> / </w:t>
+            </w:r>
+            <w:r>
+              <w:rPr>
+                <w:b w:val="0"/>
+                <w:i w:val="0"/>
+                <w:color w:val="2E6BA0"/>
+                <w:sz w:val="20"/>
+              </w:rPr>
+              <w:t>#76</w:t>
+            </w:r>
+            <w:r>
+              <w:rPr>
+                <w:b w:val="0"/>
+                <w:i w:val="0"/>
+                <w:color w:val="22303C"/>
+                <w:sz w:val="20"/>
+              </w:rPr>
+              <w:t xml:space="preserve"> / </w:t>
+            </w:r>
+            <w:r>
+              <w:rPr>
+                <w:b w:val="0"/>
+                <w:i w:val="0"/>
+                <w:color w:val="2E6BA0"/>
+                <w:sz w:val="20"/>
+              </w:rPr>
+              <w:t>#84</w:t>
             </w:r>
           </w:p>
         </w:tc>
         <w:tc>
           <w:tcPr>
-            <w:tcW w:type="dxa" w:w="7374"/>
+            <w:tcW w:type="dxa" w:w="6627"/>
           </w:tcPr>
           <w:p>
             <w:r>
@@ -3110,7 +3820,7 @@
                 <w:color w:val="22303C"/>
                 <w:sz w:val="20"/>
               </w:rPr>
-              <w:t>Website redesign / dark theme</w:t>
+              <w:t>Tutorial tip / About-popup overlap / scheduled recaps / dim welcome</w:t>
             </w:r>
           </w:p>
         </w:tc>
@@ -3118,7 +3828,7 @@
       <w:tr>
         <w:tc>
           <w:tcPr>
-            <w:tcW w:type="dxa" w:w="1330"/>
+            <w:tcW w:type="dxa" w:w="1088"/>
           </w:tcPr>
           <w:p>
             <w:r>
@@ -3128,13 +3838,13 @@
                 <w:color w:val="22303C"/>
                 <w:sz w:val="20"/>
               </w:rPr>
-              <w:t>kuantorflow</w:t>
+              <w:t>ai_agent</w:t>
             </w:r>
           </w:p>
         </w:tc>
         <w:tc>
           <w:tcPr>
-            <w:tcW w:type="dxa" w:w="1088"/>
+            <w:tcW w:type="dxa" w:w="2077"/>
           </w:tcPr>
           <w:p>
             <w:r>
@@ -3144,13 +3854,49 @@
                 <w:color w:val="2E6BA0"/>
                 <w:sz w:val="20"/>
               </w:rPr>
-              <w:t>#54</w:t>
+              <w:t>#47</w:t>
+            </w:r>
+            <w:r>
+              <w:rPr>
+                <w:b w:val="0"/>
+                <w:i w:val="0"/>
+                <w:color w:val="22303C"/>
+                <w:sz w:val="20"/>
+              </w:rPr>
+              <w:t xml:space="preserve"> / </w:t>
+            </w:r>
+            <w:r>
+              <w:rPr>
+                <w:b w:val="0"/>
+                <w:i w:val="0"/>
+                <w:color w:val="2E6BA0"/>
+                <w:sz w:val="20"/>
+              </w:rPr>
+              <w:t>#49</w:t>
+            </w:r>
+            <w:r>
+              <w:rPr>
+                <w:b w:val="0"/>
+                <w:i w:val="0"/>
+                <w:color w:val="22303C"/>
+                <w:sz w:val="20"/>
+              </w:rPr>
+              <w:t xml:space="preserve"> / </w:t>
+            </w:r>
+            <w:r>
+              <w:rPr>
+                <w:b w:val="0"/>
+                <w:i w:val="0"/>
+                <w:color w:val="2E6BA0"/>
+                <w:sz w:val="20"/>
+              </w:rPr>
+              <w:t>#50</w:t>
             </w:r>
           </w:p>
         </w:tc>
         <w:tc>
           <w:tcPr>
-            <w:tcW w:type="dxa" w:w="7374"/>
+            <w:tcW w:type="dxa" w:w="6627"/>
           </w:tcPr>
           <w:p>
             <w:r>
@@ -3160,57 +3906,7 @@
                 <w:color w:val="22303C"/>
                 <w:sz w:val="20"/>
               </w:rPr>
-              <w:t>Android app (investigation — repo, board &amp; sub-tasks created)</w:t>
-            </w:r>
-          </w:p>
-        </w:tc>
-      </w:tr>
-      <w:tr>
-        <w:tc>
-          <w:tcPr>
-            <w:tcW w:type="dxa" w:w="1330"/>
-          </w:tcPr>
-          <w:p>
-            <w:r>
-              <w:rPr>
-                <w:b w:val="0"/>
-                <w:i w:val="0"/>
-                <w:color w:val="22303C"/>
-                <w:sz w:val="20"/>
-              </w:rPr>
-              <w:t>kuantorflow</w:t>
-            </w:r>
-          </w:p>
-        </w:tc>
-        <w:tc>
-          <w:tcPr>
-            <w:tcW w:type="dxa" w:w="1088"/>
-          </w:tcPr>
-          <w:p>
-            <w:r>
-              <w:rPr>
-                <w:b w:val="0"/>
-                <w:i w:val="0"/>
-                <w:color w:val="2E6BA0"/>
-                <w:sz w:val="20"/>
-              </w:rPr>
-              <w:t>#110</w:t>
-            </w:r>
-          </w:p>
-        </w:tc>
-        <w:tc>
-          <w:tcPr>
-            <w:tcW w:type="dxa" w:w="7374"/>
-          </w:tcPr>
-          <w:p>
-            <w:r>
-              <w:rPr>
-                <w:b w:val="0"/>
-                <w:i w:val="0"/>
-                <w:color w:val="22303C"/>
-                <w:sz w:val="20"/>
-              </w:rPr>
-              <w:t>Merriam-Webster free API (blocked-on-PA workaround)</w:t>
+              <w:t>Widget-code audit / last-logs setting / faster Mykola</w:t>
             </w:r>
           </w:p>
         </w:tc>

</xml_diff>